<commit_message>
Help Desk: simpler inbox, chat-style tickets, reply channel picker, tag suggestions, branded request page
Inbox: clickable summary boxes, view tabs with counts, filters behind a
button with removable chips, a setup banner, and fewer table columns.
Tickets read as a chat (customer left, team right, notes in yellow), the
sidebar puts Delete last, and Tags suggest values from the request and the
store's common tags. Replies pick where they go: the request page by default,
or email too; WhatsApp and SMS show as not connected yet. Settings only shows
the page Save on the tabs it saves. The customer request page follows the
zioncases.com theme with a chat layout. Restores saved replies replacing the
text, adds tests, and updates both guides.

Co-Authored-By: Claude Opus 5.5 <noreply@anthropic.com>
</commit_message>
<xml_diff>
--- a/docs/Help-Desk-User-Guide-English.docx
+++ b/docs/Help-Desk-User-Guide-English.docx
@@ -98,14 +98,13 @@
           <w:sz w:val="32"/>
           <w:szCs w:val="32"/>
         </w:rPr>
-        <w:lastRenderedPageBreak/>
         <w:t>Contents</w:t>
       </w:r>
     </w:p>
     <w:sdt>
       <w:sdtPr>
         <w:alias w:val="Contents"/>
-        <w:id w:val="-1354040165"/>
+        <w:id w:val="-9455883"/>
       </w:sdtPr>
       <w:sdtEndPr/>
       <w:sdtContent>
@@ -133,7 +132,7 @@
           <w:r>
             <w:fldChar w:fldCharType="separate"/>
           </w:r>
-          <w:hyperlink w:anchor="_Toc243643313" w:history="1">
+          <w:hyperlink w:anchor="_Toc243646116" w:history="1">
             <w:r>
               <w:rPr>
                 <w:rStyle w:val="Hyperlink"/>
@@ -157,7 +156,7 @@
               <w:rPr>
                 <w:noProof/>
               </w:rPr>
-              <w:instrText xml:space="preserve"> PAGEREF _Toc243643313 \h </w:instrText>
+              <w:instrText xml:space="preserve"> PAGEREF _Toc243646116 \h </w:instrText>
             </w:r>
             <w:r>
               <w:rPr>
@@ -199,7 +198,7 @@
               <w14:ligatures w14:val="standardContextual"/>
             </w:rPr>
           </w:pPr>
-          <w:hyperlink w:anchor="_Toc243643314" w:history="1">
+          <w:hyperlink w:anchor="_Toc243646117" w:history="1">
             <w:r>
               <w:rPr>
                 <w:rStyle w:val="Hyperlink"/>
@@ -223,7 +222,7 @@
               <w:rPr>
                 <w:noProof/>
               </w:rPr>
-              <w:instrText xml:space="preserve"> PAGEREF _Toc243643314 \h </w:instrText>
+              <w:instrText xml:space="preserve"> PAGEREF _Toc243646117 \h </w:instrText>
             </w:r>
             <w:r>
               <w:rPr>
@@ -265,7 +264,7 @@
               <w14:ligatures w14:val="standardContextual"/>
             </w:rPr>
           </w:pPr>
-          <w:hyperlink w:anchor="_Toc243643315" w:history="1">
+          <w:hyperlink w:anchor="_Toc243646118" w:history="1">
             <w:r>
               <w:rPr>
                 <w:rStyle w:val="Hyperlink"/>
@@ -289,7 +288,7 @@
               <w:rPr>
                 <w:noProof/>
               </w:rPr>
-              <w:instrText xml:space="preserve"> PAGEREF _Toc243643315 \h </w:instrText>
+              <w:instrText xml:space="preserve"> PAGEREF _Toc243646118 \h </w:instrText>
             </w:r>
             <w:r>
               <w:rPr>
@@ -331,7 +330,7 @@
               <w14:ligatures w14:val="standardContextual"/>
             </w:rPr>
           </w:pPr>
-          <w:hyperlink w:anchor="_Toc243643316" w:history="1">
+          <w:hyperlink w:anchor="_Toc243646119" w:history="1">
             <w:r>
               <w:rPr>
                 <w:rStyle w:val="Hyperlink"/>
@@ -355,7 +354,7 @@
               <w:rPr>
                 <w:noProof/>
               </w:rPr>
-              <w:instrText xml:space="preserve"> PAGEREF _Toc243643316 \h </w:instrText>
+              <w:instrText xml:space="preserve"> PAGEREF _Toc243646119 \h </w:instrText>
             </w:r>
             <w:r>
               <w:rPr>
@@ -397,7 +396,7 @@
               <w14:ligatures w14:val="standardContextual"/>
             </w:rPr>
           </w:pPr>
-          <w:hyperlink w:anchor="_Toc243643317" w:history="1">
+          <w:hyperlink w:anchor="_Toc243646120" w:history="1">
             <w:r>
               <w:rPr>
                 <w:rStyle w:val="Hyperlink"/>
@@ -421,7 +420,7 @@
               <w:rPr>
                 <w:noProof/>
               </w:rPr>
-              <w:instrText xml:space="preserve"> PAGEREF _Toc243643317 \h </w:instrText>
+              <w:instrText xml:space="preserve"> PAGEREF _Toc243646120 \h </w:instrText>
             </w:r>
             <w:r>
               <w:rPr>
@@ -463,7 +462,7 @@
               <w14:ligatures w14:val="standardContextual"/>
             </w:rPr>
           </w:pPr>
-          <w:hyperlink w:anchor="_Toc243643318" w:history="1">
+          <w:hyperlink w:anchor="_Toc243646121" w:history="1">
             <w:r>
               <w:rPr>
                 <w:rStyle w:val="Hyperlink"/>
@@ -487,7 +486,7 @@
               <w:rPr>
                 <w:noProof/>
               </w:rPr>
-              <w:instrText xml:space="preserve"> PAGEREF _Toc243643318 \h </w:instrText>
+              <w:instrText xml:space="preserve"> PAGEREF _Toc243646121 \h </w:instrText>
             </w:r>
             <w:r>
               <w:rPr>
@@ -529,7 +528,7 @@
               <w14:ligatures w14:val="standardContextual"/>
             </w:rPr>
           </w:pPr>
-          <w:hyperlink w:anchor="_Toc243643319" w:history="1">
+          <w:hyperlink w:anchor="_Toc243646122" w:history="1">
             <w:r>
               <w:rPr>
                 <w:rStyle w:val="Hyperlink"/>
@@ -553,7 +552,7 @@
               <w:rPr>
                 <w:noProof/>
               </w:rPr>
-              <w:instrText xml:space="preserve"> PAGEREF _Toc243643319 \h </w:instrText>
+              <w:instrText xml:space="preserve"> PAGEREF _Toc243646122 \h </w:instrText>
             </w:r>
             <w:r>
               <w:rPr>
@@ -595,7 +594,7 @@
               <w14:ligatures w14:val="standardContextual"/>
             </w:rPr>
           </w:pPr>
-          <w:hyperlink w:anchor="_Toc243643320" w:history="1">
+          <w:hyperlink w:anchor="_Toc243646123" w:history="1">
             <w:r>
               <w:rPr>
                 <w:rStyle w:val="Hyperlink"/>
@@ -619,7 +618,7 @@
               <w:rPr>
                 <w:noProof/>
               </w:rPr>
-              <w:instrText xml:space="preserve"> PAGEREF _Toc243643320 \h </w:instrText>
+              <w:instrText xml:space="preserve"> PAGEREF _Toc243646123 \h </w:instrText>
             </w:r>
             <w:r>
               <w:rPr>
@@ -661,7 +660,7 @@
               <w14:ligatures w14:val="standardContextual"/>
             </w:rPr>
           </w:pPr>
-          <w:hyperlink w:anchor="_Toc243643321" w:history="1">
+          <w:hyperlink w:anchor="_Toc243646124" w:history="1">
             <w:r>
               <w:rPr>
                 <w:rStyle w:val="Hyperlink"/>
@@ -685,7 +684,7 @@
               <w:rPr>
                 <w:noProof/>
               </w:rPr>
-              <w:instrText xml:space="preserve"> PAGEREF _Toc243643321 \h </w:instrText>
+              <w:instrText xml:space="preserve"> PAGEREF _Toc243646124 \h </w:instrText>
             </w:r>
             <w:r>
               <w:rPr>
@@ -727,7 +726,7 @@
               <w14:ligatures w14:val="standardContextual"/>
             </w:rPr>
           </w:pPr>
-          <w:hyperlink w:anchor="_Toc243643322" w:history="1">
+          <w:hyperlink w:anchor="_Toc243646125" w:history="1">
             <w:r>
               <w:rPr>
                 <w:rStyle w:val="Hyperlink"/>
@@ -751,7 +750,7 @@
               <w:rPr>
                 <w:noProof/>
               </w:rPr>
-              <w:instrText xml:space="preserve"> PAGEREF _Toc243643322 \h </w:instrText>
+              <w:instrText xml:space="preserve"> PAGEREF _Toc243646125 \h </w:instrText>
             </w:r>
             <w:r>
               <w:rPr>
@@ -793,7 +792,7 @@
               <w14:ligatures w14:val="standardContextual"/>
             </w:rPr>
           </w:pPr>
-          <w:hyperlink w:anchor="_Toc243643323" w:history="1">
+          <w:hyperlink w:anchor="_Toc243646126" w:history="1">
             <w:r>
               <w:rPr>
                 <w:rStyle w:val="Hyperlink"/>
@@ -817,7 +816,7 @@
               <w:rPr>
                 <w:noProof/>
               </w:rPr>
-              <w:instrText xml:space="preserve"> PAGEREF _Toc243643323 \h </w:instrText>
+              <w:instrText xml:space="preserve"> PAGEREF _Toc243646126 \h </w:instrText>
             </w:r>
             <w:r>
               <w:rPr>
@@ -859,7 +858,7 @@
               <w14:ligatures w14:val="standardContextual"/>
             </w:rPr>
           </w:pPr>
-          <w:hyperlink w:anchor="_Toc243643324" w:history="1">
+          <w:hyperlink w:anchor="_Toc243646127" w:history="1">
             <w:r>
               <w:rPr>
                 <w:rStyle w:val="Hyperlink"/>
@@ -883,7 +882,7 @@
               <w:rPr>
                 <w:noProof/>
               </w:rPr>
-              <w:instrText xml:space="preserve"> PAGEREF _Toc243643324 \h </w:instrText>
+              <w:instrText xml:space="preserve"> PAGEREF _Toc243646127 \h </w:instrText>
             </w:r>
             <w:r>
               <w:rPr>
@@ -925,7 +924,7 @@
               <w14:ligatures w14:val="standardContextual"/>
             </w:rPr>
           </w:pPr>
-          <w:hyperlink w:anchor="_Toc243643325" w:history="1">
+          <w:hyperlink w:anchor="_Toc243646128" w:history="1">
             <w:r>
               <w:rPr>
                 <w:rStyle w:val="Hyperlink"/>
@@ -949,7 +948,7 @@
               <w:rPr>
                 <w:noProof/>
               </w:rPr>
-              <w:instrText xml:space="preserve"> PAGEREF _Toc243643325 \h </w:instrText>
+              <w:instrText xml:space="preserve"> PAGEREF _Toc243646128 \h </w:instrText>
             </w:r>
             <w:r>
               <w:rPr>
@@ -991,7 +990,7 @@
               <w14:ligatures w14:val="standardContextual"/>
             </w:rPr>
           </w:pPr>
-          <w:hyperlink w:anchor="_Toc243643326" w:history="1">
+          <w:hyperlink w:anchor="_Toc243646129" w:history="1">
             <w:r>
               <w:rPr>
                 <w:rStyle w:val="Hyperlink"/>
@@ -1015,7 +1014,7 @@
               <w:rPr>
                 <w:noProof/>
               </w:rPr>
-              <w:instrText xml:space="preserve"> PAGEREF _Toc243643326 \h </w:instrText>
+              <w:instrText xml:space="preserve"> PAGEREF _Toc243646129 \h </w:instrText>
             </w:r>
             <w:r>
               <w:rPr>
@@ -1057,7 +1056,7 @@
               <w14:ligatures w14:val="standardContextual"/>
             </w:rPr>
           </w:pPr>
-          <w:hyperlink w:anchor="_Toc243643327" w:history="1">
+          <w:hyperlink w:anchor="_Toc243646130" w:history="1">
             <w:r>
               <w:rPr>
                 <w:rStyle w:val="Hyperlink"/>
@@ -1081,7 +1080,7 @@
               <w:rPr>
                 <w:noProof/>
               </w:rPr>
-              <w:instrText xml:space="preserve"> PAGEREF _Toc243643327 \h </w:instrText>
+              <w:instrText xml:space="preserve"> PAGEREF _Toc243646130 \h </w:instrText>
             </w:r>
             <w:r>
               <w:rPr>
@@ -1123,7 +1122,7 @@
               <w14:ligatures w14:val="standardContextual"/>
             </w:rPr>
           </w:pPr>
-          <w:hyperlink w:anchor="_Toc243643328" w:history="1">
+          <w:hyperlink w:anchor="_Toc243646131" w:history="1">
             <w:r>
               <w:rPr>
                 <w:rStyle w:val="Hyperlink"/>
@@ -1147,7 +1146,7 @@
               <w:rPr>
                 <w:noProof/>
               </w:rPr>
-              <w:instrText xml:space="preserve"> PAGEREF _Toc243643328 \h </w:instrText>
+              <w:instrText xml:space="preserve"> PAGEREF _Toc243646131 \h </w:instrText>
             </w:r>
             <w:r>
               <w:rPr>
@@ -1189,7 +1188,7 @@
               <w14:ligatures w14:val="standardContextual"/>
             </w:rPr>
           </w:pPr>
-          <w:hyperlink w:anchor="_Toc243643329" w:history="1">
+          <w:hyperlink w:anchor="_Toc243646132" w:history="1">
             <w:r>
               <w:rPr>
                 <w:rStyle w:val="Hyperlink"/>
@@ -1213,7 +1212,7 @@
               <w:rPr>
                 <w:noProof/>
               </w:rPr>
-              <w:instrText xml:space="preserve"> PAGEREF _Toc243643329 \h </w:instrText>
+              <w:instrText xml:space="preserve"> PAGEREF _Toc243646132 \h </w:instrText>
             </w:r>
             <w:r>
               <w:rPr>
@@ -1255,7 +1254,7 @@
               <w14:ligatures w14:val="standardContextual"/>
             </w:rPr>
           </w:pPr>
-          <w:hyperlink w:anchor="_Toc243643330" w:history="1">
+          <w:hyperlink w:anchor="_Toc243646133" w:history="1">
             <w:r>
               <w:rPr>
                 <w:rStyle w:val="Hyperlink"/>
@@ -1279,7 +1278,7 @@
               <w:rPr>
                 <w:noProof/>
               </w:rPr>
-              <w:instrText xml:space="preserve"> PAGEREF _Toc243643330 \h </w:instrText>
+              <w:instrText xml:space="preserve"> PAGEREF _Toc243646133 \h </w:instrText>
             </w:r>
             <w:r>
               <w:rPr>
@@ -1321,7 +1320,7 @@
               <w14:ligatures w14:val="standardContextual"/>
             </w:rPr>
           </w:pPr>
-          <w:hyperlink w:anchor="_Toc243643331" w:history="1">
+          <w:hyperlink w:anchor="_Toc243646134" w:history="1">
             <w:r>
               <w:rPr>
                 <w:rStyle w:val="Hyperlink"/>
@@ -1345,7 +1344,7 @@
               <w:rPr>
                 <w:noProof/>
               </w:rPr>
-              <w:instrText xml:space="preserve"> PAGEREF _Toc243643331 \h </w:instrText>
+              <w:instrText xml:space="preserve"> PAGEREF _Toc243646134 \h </w:instrText>
             </w:r>
             <w:r>
               <w:rPr>
@@ -1387,7 +1386,7 @@
               <w14:ligatures w14:val="standardContextual"/>
             </w:rPr>
           </w:pPr>
-          <w:hyperlink w:anchor="_Toc243643332" w:history="1">
+          <w:hyperlink w:anchor="_Toc243646135" w:history="1">
             <w:r>
               <w:rPr>
                 <w:rStyle w:val="Hyperlink"/>
@@ -1411,7 +1410,7 @@
               <w:rPr>
                 <w:noProof/>
               </w:rPr>
-              <w:instrText xml:space="preserve"> PAGEREF _Toc243643332 \h </w:instrText>
+              <w:instrText xml:space="preserve"> PAGEREF _Toc243646135 \h </w:instrText>
             </w:r>
             <w:r>
               <w:rPr>
@@ -1453,7 +1452,7 @@
               <w14:ligatures w14:val="standardContextual"/>
             </w:rPr>
           </w:pPr>
-          <w:hyperlink w:anchor="_Toc243643333" w:history="1">
+          <w:hyperlink w:anchor="_Toc243646136" w:history="1">
             <w:r>
               <w:rPr>
                 <w:rStyle w:val="Hyperlink"/>
@@ -1477,7 +1476,7 @@
               <w:rPr>
                 <w:noProof/>
               </w:rPr>
-              <w:instrText xml:space="preserve"> PAGEREF _Toc243643333 \h </w:instrText>
+              <w:instrText xml:space="preserve"> PAGEREF _Toc243646136 \h </w:instrText>
             </w:r>
             <w:r>
               <w:rPr>
@@ -1519,7 +1518,7 @@
               <w14:ligatures w14:val="standardContextual"/>
             </w:rPr>
           </w:pPr>
-          <w:hyperlink w:anchor="_Toc243643334" w:history="1">
+          <w:hyperlink w:anchor="_Toc243646137" w:history="1">
             <w:r>
               <w:rPr>
                 <w:rStyle w:val="Hyperlink"/>
@@ -1543,7 +1542,7 @@
               <w:rPr>
                 <w:noProof/>
               </w:rPr>
-              <w:instrText xml:space="preserve"> PAGEREF _Toc243643334 \h </w:instrText>
+              <w:instrText xml:space="preserve"> PAGEREF _Toc243646137 \h </w:instrText>
             </w:r>
             <w:r>
               <w:rPr>
@@ -1585,7 +1584,7 @@
               <w14:ligatures w14:val="standardContextual"/>
             </w:rPr>
           </w:pPr>
-          <w:hyperlink w:anchor="_Toc243643335" w:history="1">
+          <w:hyperlink w:anchor="_Toc243646138" w:history="1">
             <w:r>
               <w:rPr>
                 <w:rStyle w:val="Hyperlink"/>
@@ -1609,7 +1608,7 @@
               <w:rPr>
                 <w:noProof/>
               </w:rPr>
-              <w:instrText xml:space="preserve"> PAGEREF _Toc243643335 \h </w:instrText>
+              <w:instrText xml:space="preserve"> PAGEREF _Toc243646138 \h </w:instrText>
             </w:r>
             <w:r>
               <w:rPr>
@@ -1652,9 +1651,8 @@
       <w:pPr>
         <w:pStyle w:val="Heading1"/>
       </w:pPr>
-      <w:bookmarkStart w:id="0" w:name="_Toc243643313"/>
-      <w:r>
-        <w:lastRenderedPageBreak/>
+      <w:bookmarkStart w:id="0" w:name="_Toc243646116"/>
+      <w:r>
         <w:t>1. What the Help Desk does</w:t>
       </w:r>
       <w:bookmarkEnd w:id="0"/>
@@ -2134,7 +2132,7 @@
       <w:pPr>
         <w:pStyle w:val="Heading2"/>
       </w:pPr>
-      <w:bookmarkStart w:id="1" w:name="_Toc243643314"/>
+      <w:bookmarkStart w:id="1" w:name="_Toc243646117"/>
       <w:r>
         <w:t>The flow in one line</w:t>
       </w:r>
@@ -2152,7 +2150,7 @@
       <w:pPr>
         <w:pStyle w:val="Heading2"/>
       </w:pPr>
-      <w:bookmarkStart w:id="2" w:name="_Toc243643315"/>
+      <w:bookmarkStart w:id="2" w:name="_Toc243646118"/>
       <w:r>
         <w:t>Ticket statuses</w:t>
       </w:r>
@@ -2465,7 +2463,7 @@
       <w:pPr>
         <w:pStyle w:val="Heading1"/>
       </w:pPr>
-      <w:bookmarkStart w:id="3" w:name="_Toc243643316"/>
+      <w:bookmarkStart w:id="3" w:name="_Toc243646119"/>
       <w:r>
         <w:t>2. First-time setup (on each store)</w:t>
       </w:r>
@@ -2493,7 +2491,6 @@
           <w:b/>
           <w:bCs/>
         </w:rPr>
-        <w:lastRenderedPageBreak/>
         <w:t>Add the form to a page.</w:t>
       </w:r>
       <w:r>
@@ -2624,7 +2621,7 @@
       <w:pPr>
         <w:pStyle w:val="Heading1"/>
       </w:pPr>
-      <w:bookmarkStart w:id="4" w:name="_Toc243643317"/>
+      <w:bookmarkStart w:id="4" w:name="_Toc243646120"/>
       <w:r>
         <w:t>3. What the customer sees</w:t>
       </w:r>
@@ -2634,7 +2631,7 @@
       <w:pPr>
         <w:pStyle w:val="Heading2"/>
       </w:pPr>
-      <w:bookmarkStart w:id="5" w:name="_Toc243643318"/>
+      <w:bookmarkStart w:id="5" w:name="_Toc243646121"/>
       <w:r>
         <w:t>Sending the form</w:t>
       </w:r>
@@ -2723,7 +2720,7 @@
       <w:pPr>
         <w:pStyle w:val="Heading2"/>
       </w:pPr>
-      <w:bookmarkStart w:id="6" w:name="_Toc243643319"/>
+      <w:bookmarkStart w:id="6" w:name="_Toc243646122"/>
       <w:r>
         <w:t>The request page</w:t>
       </w:r>
@@ -2805,7 +2802,7 @@
       <w:pPr>
         <w:pStyle w:val="Heading1"/>
       </w:pPr>
-      <w:bookmarkStart w:id="7" w:name="_Toc243643320"/>
+      <w:bookmarkStart w:id="7" w:name="_Toc243646123"/>
       <w:r>
         <w:t>4. Daily work: inbox and tickets</w:t>
       </w:r>
@@ -2815,7 +2812,7 @@
       <w:pPr>
         <w:pStyle w:val="Heading2"/>
       </w:pPr>
-      <w:bookmarkStart w:id="8" w:name="_Toc243643321"/>
+      <w:bookmarkStart w:id="8" w:name="_Toc243646124"/>
       <w:r>
         <w:t>The inbox</w:t>
       </w:r>
@@ -2835,10 +2832,20 @@
           <w:b/>
           <w:bCs/>
         </w:rPr>
-        <w:t>Top numbers:</w:t>
-      </w:r>
-      <w:r>
-        <w:t xml:space="preserve"> Needs attention, High priority, average first response time (30 days), Resolved (7 days).</w:t>
+        <w:t>Four boxes at the top:</w:t>
+      </w:r>
+      <w:r>
+        <w:t xml:space="preserve"> Needs attention, Waiting on customer, High priority and Flagged photos. Click a box to see those tickets. While setup is unfinished, a "Finish setting up" banner links to the steps left. Full numbers and the setup checklist are on the </w:t>
+      </w:r>
+      <w:r>
+        <w:rPr>
+          <w:b/>
+          <w:bCs/>
+        </w:rPr>
+        <w:t>Overview &amp; setup</w:t>
+      </w:r>
+      <w:r>
+        <w:t xml:space="preserve"> tab.</w:t>
       </w:r>
     </w:p>
     <w:p>
@@ -2855,10 +2862,10 @@
           <w:b/>
           <w:bCs/>
         </w:rPr>
-        <w:t>Views:</w:t>
-      </w:r>
-      <w:r>
-        <w:t xml:space="preserve"> Needs attention · Unassigned · High priority · Waiting on customer · Resolved · Flagged photos · All tickets.</w:t>
+        <w:t>View tabs:</w:t>
+      </w:r>
+      <w:r>
+        <w:t xml:space="preserve"> Needs attention · Waiting on customer · Resolved · All tickets, then Unassigned · High priority · Flagged photos, each with its count.</w:t>
       </w:r>
     </w:p>
     <w:p>
@@ -2875,21 +2882,20 @@
           <w:b/>
           <w:bCs/>
         </w:rPr>
-        <w:lastRenderedPageBreak/>
         <w:t>Search</w:t>
       </w:r>
       <w:r>
-        <w:t xml:space="preserve"> by #number, name, email, order number or tag. </w:t>
+        <w:t xml:space="preserve"> by #number, name, email, order number or tag. Click </w:t>
       </w:r>
       <w:r>
         <w:rPr>
           <w:b/>
           <w:bCs/>
         </w:rPr>
-        <w:t>Filter</w:t>
-      </w:r>
-      <w:r>
-        <w:t xml:space="preserve"> by topic, priority, assignee and date.</w:t>
+        <w:t>Filters</w:t>
+      </w:r>
+      <w:r>
+        <w:t xml:space="preserve"> for topic, priority, assignee and date; active filters show as chips you can remove. Sort sits next to the search.</w:t>
       </w:r>
     </w:p>
     <w:p>
@@ -2929,7 +2935,7 @@
         <w:t>Bulk actions:</w:t>
       </w:r>
       <w:r>
-        <w:t xml:space="preserve"> tick several tickets to change status, priority or assignee together, or delete them.</w:t>
+        <w:t xml:space="preserve"> tick one or more tickets to change status, priority or assignee together, or delete them.</w:t>
       </w:r>
     </w:p>
     <w:p>
@@ -2949,7 +2955,7 @@
       <w:pPr>
         <w:pStyle w:val="Heading2"/>
       </w:pPr>
-      <w:bookmarkStart w:id="9" w:name="_Toc243643322"/>
+      <w:bookmarkStart w:id="9" w:name="_Toc243646125"/>
       <w:r>
         <w:t>Working a ticket</w:t>
       </w:r>
@@ -2972,7 +2978,7 @@
         <w:t>Read the conversation.</w:t>
       </w:r>
       <w:r>
-        <w:t xml:space="preserve"> The request, photos, replies, notes and activity are on one timeline.</w:t>
+        <w:t xml:space="preserve"> It reads like a chat: the customer on the left (grey), your team on the right (navy) and internal notes on the right in yellow. Photos, notes and activity are on the same timeline.</w:t>
       </w:r>
     </w:p>
     <w:p>
@@ -3090,14 +3096,24 @@
         <w:spacing w:after="120"/>
       </w:pPr>
       <w:r>
-        <w:t>On the right you can change Status, Priority, Assignee and Tags, and see the customer's details, recent Shopify orders, earlier tickets and email status.</w:t>
+        <w:t xml:space="preserve">On the right you can change Status, Priority, Assignee and Tags. Under Tags you get </w:t>
+      </w:r>
+      <w:r>
+        <w:rPr>
+          <w:b/>
+          <w:bCs/>
+        </w:rPr>
+        <w:t>suggestions</w:t>
+      </w:r>
+      <w:r>
+        <w:t>: "From this request" (what the customer chose or wrote, such as defective, return or damaged) and "Your team uses" (your most common tags). Click a suggestion to add it. Below are the customer's details, recent Shopify orders, earlier tickets, email status and, at the bottom, Delete ticket.</w:t>
       </w:r>
     </w:p>
     <w:p>
       <w:pPr>
         <w:pStyle w:val="Heading2"/>
       </w:pPr>
-      <w:bookmarkStart w:id="10" w:name="_Toc243643323"/>
+      <w:bookmarkStart w:id="10" w:name="_Toc243646126"/>
       <w:r>
         <w:t>Which status when</w:t>
       </w:r>
@@ -3375,7 +3391,7 @@
       <w:pPr>
         <w:pStyle w:val="Heading2"/>
       </w:pPr>
-      <w:bookmarkStart w:id="11" w:name="_Toc243643324"/>
+      <w:bookmarkStart w:id="11" w:name="_Toc243646127"/>
       <w:r>
         <w:t>Deleting a ticket</w:t>
       </w:r>
@@ -3386,7 +3402,7 @@
         <w:spacing w:after="120"/>
       </w:pPr>
       <w:r>
-        <w:t xml:space="preserve">Use the red bin button on the ticket row, the </w:t>
+        <w:t xml:space="preserve">Use </w:t>
       </w:r>
       <w:r>
         <w:rPr>
@@ -3396,7 +3412,7 @@
         <w:t>Delete ticket</w:t>
       </w:r>
       <w:r>
-        <w:t xml:space="preserve"> section inside a ticket, or select several tickets and choose Delete. </w:t>
+        <w:t xml:space="preserve"> at the bottom of the ticket sidebar, or tick one or more tickets in the inbox and choose Delete. </w:t>
       </w:r>
       <w:r>
         <w:rPr>
@@ -3413,7 +3429,7 @@
       <w:pPr>
         <w:pStyle w:val="Heading1"/>
       </w:pPr>
-      <w:bookmarkStart w:id="12" w:name="_Toc243643325"/>
+      <w:bookmarkStart w:id="12" w:name="_Toc243646128"/>
       <w:r>
         <w:t>5. AI photo check</w:t>
       </w:r>
@@ -3483,7 +3499,6 @@
                 <w:bCs/>
                 <w:color w:val="FFFFFF"/>
               </w:rPr>
-              <w:lastRenderedPageBreak/>
               <w:t>Check</w:t>
             </w:r>
           </w:p>
@@ -3963,7 +3978,7 @@
       <w:pPr>
         <w:pStyle w:val="Heading2"/>
       </w:pPr>
-      <w:bookmarkStart w:id="13" w:name="_Toc243643326"/>
+      <w:bookmarkStart w:id="13" w:name="_Toc243646129"/>
       <w:r>
         <w:t>What the badge means</w:t>
       </w:r>
@@ -4287,7 +4302,7 @@
       <w:pPr>
         <w:pStyle w:val="Heading2"/>
       </w:pPr>
-      <w:bookmarkStart w:id="14" w:name="_Toc243643327"/>
+      <w:bookmarkStart w:id="14" w:name="_Toc243646130"/>
       <w:r>
         <w:t>Opening the full report</w:t>
       </w:r>
@@ -4395,7 +4410,6 @@
           <w:b/>
           <w:bCs/>
         </w:rPr>
-        <w:lastRenderedPageBreak/>
         <w:t>Checks at a glance:</w:t>
       </w:r>
       <w:r>
@@ -4629,7 +4643,7 @@
       <w:pPr>
         <w:pStyle w:val="Heading2"/>
       </w:pPr>
-      <w:bookmarkStart w:id="15" w:name="_Toc243643328"/>
+      <w:bookmarkStart w:id="15" w:name="_Toc243646131"/>
       <w:r>
         <w:t>Is the AI detector working?</w:t>
       </w:r>
@@ -4989,7 +5003,7 @@
       <w:pPr>
         <w:pStyle w:val="Heading2"/>
       </w:pPr>
-      <w:bookmarkStart w:id="16" w:name="_Toc243643329"/>
+      <w:bookmarkStart w:id="16" w:name="_Toc243646132"/>
       <w:r>
         <w:t>When the detector runs (Settings → AI photo check)</w:t>
       </w:r>
@@ -5087,9 +5101,8 @@
       <w:pPr>
         <w:pStyle w:val="Heading1"/>
       </w:pPr>
-      <w:bookmarkStart w:id="17" w:name="_Toc243643330"/>
-      <w:r>
-        <w:lastRenderedPageBreak/>
+      <w:bookmarkStart w:id="17" w:name="_Toc243646133"/>
+      <w:r>
         <w:t>6. Emails</w:t>
       </w:r>
       <w:bookmarkEnd w:id="17"/>
@@ -5569,7 +5582,7 @@
       <w:pPr>
         <w:pStyle w:val="Heading1"/>
       </w:pPr>
-      <w:bookmarkStart w:id="18" w:name="_Toc243643331"/>
+      <w:bookmarkStart w:id="18" w:name="_Toc243646134"/>
       <w:r>
         <w:t>7. Troubleshooting</w:t>
       </w:r>
@@ -6072,7 +6085,7 @@
       <w:pPr>
         <w:pStyle w:val="Heading1"/>
       </w:pPr>
-      <w:bookmarkStart w:id="19" w:name="_Toc243643332"/>
+      <w:bookmarkStart w:id="19" w:name="_Toc243646135"/>
       <w:r>
         <w:t>8. Quick reference</w:t>
       </w:r>
@@ -6082,7 +6095,7 @@
       <w:pPr>
         <w:pStyle w:val="Heading2"/>
       </w:pPr>
-      <w:bookmarkStart w:id="20" w:name="_Toc243643333"/>
+      <w:bookmarkStart w:id="20" w:name="_Toc243646136"/>
       <w:r>
         <w:t>Every day</w:t>
       </w:r>
@@ -6098,7 +6111,6 @@
         <w:spacing w:after="60"/>
       </w:pPr>
       <w:r>
-        <w:lastRenderedPageBreak/>
         <w:t xml:space="preserve">Clear the </w:t>
       </w:r>
       <w:r>
@@ -6175,7 +6187,7 @@
       <w:pPr>
         <w:pStyle w:val="Heading2"/>
       </w:pPr>
-      <w:bookmarkStart w:id="21" w:name="_Toc243643334"/>
+      <w:bookmarkStart w:id="21" w:name="_Toc243646137"/>
       <w:r>
         <w:t>Never forget</w:t>
       </w:r>
@@ -6224,7 +6236,7 @@
       <w:pPr>
         <w:pStyle w:val="Heading2"/>
       </w:pPr>
-      <w:bookmarkStart w:id="22" w:name="_Toc243643335"/>
+      <w:bookmarkStart w:id="22" w:name="_Toc243646138"/>
       <w:r>
         <w:t>Still to do</w:t>
       </w:r>
@@ -6377,64 +6389,68 @@
 <file path=word/numbering.xml><?xml version="1.0" encoding="utf-8"?>
 <w:numbering xmlns:wpc="http://schemas.microsoft.com/office/word/2010/wordprocessingCanvas" xmlns:cx="http://schemas.microsoft.com/office/drawing/2014/chartex" xmlns:cx1="http://schemas.microsoft.com/office/drawing/2015/9/8/chartex" xmlns:cx2="http://schemas.microsoft.com/office/drawing/2015/10/21/chartex" xmlns:cx3="http://schemas.microsoft.com/office/drawing/2016/5/9/chartex" xmlns:cx4="http://schemas.microsoft.com/office/drawing/2016/5/10/chartex" xmlns:cx5="http://schemas.microsoft.com/office/drawing/2016/5/11/chartex" xmlns:cx6="http://schemas.microsoft.com/office/drawing/2016/5/12/chartex" xmlns:cx7="http://schemas.microsoft.com/office/drawing/2016/5/13/chartex" xmlns:cx8="http://schemas.microsoft.com/office/drawing/2016/5/14/chartex" xmlns:mc="http://schemas.openxmlformats.org/markup-compatibility/2006" xmlns:aink="http://schemas.microsoft.com/office/drawing/2016/ink" xmlns:am3d="http://schemas.microsoft.com/office/drawing/2017/model3d" xmlns:o="urn:schemas-microsoft-com:office:office" xmlns:oel="http://schemas.microsoft.com/office/2019/extlst" xmlns:r="http://schemas.openxmlformats.org/officeDocument/2006/relationships" xmlns:m="http://schemas.openxmlformats.org/officeDocument/2006/math" xmlns:v="urn:schemas-microsoft-com:vml" xmlns:wp14="http://schemas.microsoft.com/office/word/2010/wordprocessingDrawing" xmlns:wp="http://schemas.openxmlformats.org/drawingml/2006/wordprocessingDrawing" xmlns:w10="urn:schemas-microsoft-com:office:word" xmlns:w="http://schemas.openxmlformats.org/wordprocessingml/2006/main" xmlns:w14="http://schemas.microsoft.com/office/word/2010/wordml" xmlns:w15="http://schemas.microsoft.com/office/word/2012/wordml" xmlns:w16cex="http://schemas.microsoft.com/office/word/2018/wordml/cex" xmlns:w16cid="http://schemas.microsoft.com/office/word/2016/wordml/cid" xmlns:w16="http://schemas.microsoft.com/office/word/2018/wordml" xmlns:w16du="http://schemas.microsoft.com/office/word/2023/wordml/word16du" xmlns:w16sdtdh="http://schemas.microsoft.com/office/word/2020/wordml/sdtdatahash" xmlns:w16sdtfl="http://schemas.microsoft.com/office/word/2024/wordml/sdtformatlock" xmlns:w16se="http://schemas.microsoft.com/office/word/2015/wordml/symex" xmlns:wpg="http://schemas.microsoft.com/office/word/2010/wordprocessingGroup" xmlns:wpi="http://schemas.microsoft.com/office/word/2010/wordprocessingInk" xmlns:wne="http://schemas.microsoft.com/office/word/2006/wordml" xmlns:wps="http://schemas.microsoft.com/office/word/2010/wordprocessingShape" mc:Ignorable="w14 w15 w16se w16cid w16 w16cex w16sdtdh w16sdtfl w16du wp14">
   <w:abstractNum w:abstractNumId="0" w15:restartNumberingAfterBreak="0">
-    <w:nsid w:val="3E84153B"/>
+    <w:nsid w:val="483B5162"/>
     <w:multiLevelType w:val="hybridMultilevel"/>
-    <w:tmpl w:val="4F54CB40"/>
-    <w:lvl w:ilvl="0" w:tplc="DC7C132C">
+    <w:tmpl w:val="E1ECC588"/>
+    <w:lvl w:ilvl="0" w:tplc="A7E20694">
       <w:start w:val="1"/>
-      <w:numFmt w:val="decimal"/>
-      <w:lvlText w:val="%1."/>
+      <w:numFmt w:val="bullet"/>
+      <w:lvlText w:val="•"/>
       <w:lvlJc w:val="left"/>
       <w:pPr>
-        <w:ind w:left="540" w:hanging="360"/>
+        <w:ind w:left="540" w:hanging="270"/>
       </w:pPr>
     </w:lvl>
-    <w:lvl w:ilvl="1" w:tplc="D286DDD0">
+    <w:lvl w:ilvl="1" w:tplc="D556EF78">
+      <w:start w:val="1"/>
+      <w:numFmt w:val="bullet"/>
+      <w:lvlText w:val="–"/>
+      <w:lvlJc w:val="left"/>
+      <w:pPr>
+        <w:ind w:left="1080" w:hanging="270"/>
+      </w:pPr>
+    </w:lvl>
+    <w:lvl w:ilvl="2" w:tplc="7A42AA50">
       <w:numFmt w:val="decimal"/>
       <w:lvlText w:val=""/>
       <w:lvlJc w:val="left"/>
     </w:lvl>
-    <w:lvl w:ilvl="2" w:tplc="1792803C">
+    <w:lvl w:ilvl="3" w:tplc="468CEBEE">
       <w:numFmt w:val="decimal"/>
       <w:lvlText w:val=""/>
       <w:lvlJc w:val="left"/>
     </w:lvl>
-    <w:lvl w:ilvl="3" w:tplc="E766B78A">
+    <w:lvl w:ilvl="4" w:tplc="A44C8166">
       <w:numFmt w:val="decimal"/>
       <w:lvlText w:val=""/>
       <w:lvlJc w:val="left"/>
     </w:lvl>
-    <w:lvl w:ilvl="4" w:tplc="AADE83F2">
+    <w:lvl w:ilvl="5" w:tplc="8BD8479A">
       <w:numFmt w:val="decimal"/>
       <w:lvlText w:val=""/>
       <w:lvlJc w:val="left"/>
     </w:lvl>
-    <w:lvl w:ilvl="5" w:tplc="69485F52">
+    <w:lvl w:ilvl="6" w:tplc="4274EF42">
       <w:numFmt w:val="decimal"/>
       <w:lvlText w:val=""/>
       <w:lvlJc w:val="left"/>
     </w:lvl>
-    <w:lvl w:ilvl="6" w:tplc="63AC2A52">
+    <w:lvl w:ilvl="7" w:tplc="594AED08">
       <w:numFmt w:val="decimal"/>
       <w:lvlText w:val=""/>
       <w:lvlJc w:val="left"/>
     </w:lvl>
-    <w:lvl w:ilvl="7" w:tplc="FB8A8F56">
-      <w:numFmt w:val="decimal"/>
-      <w:lvlText w:val=""/>
-      <w:lvlJc w:val="left"/>
-    </w:lvl>
-    <w:lvl w:ilvl="8" w:tplc="7BB42ED2">
+    <w:lvl w:ilvl="8" w:tplc="E4E4A644">
       <w:numFmt w:val="decimal"/>
       <w:lvlText w:val=""/>
       <w:lvlJc w:val="left"/>
     </w:lvl>
   </w:abstractNum>
   <w:abstractNum w:abstractNumId="1" w15:restartNumberingAfterBreak="0">
-    <w:nsid w:val="627749C7"/>
+    <w:nsid w:val="4BD44814"/>
     <w:multiLevelType w:val="hybridMultilevel"/>
-    <w:tmpl w:val="45E6F37A"/>
-    <w:lvl w:ilvl="0" w:tplc="11F2C88A" w:tentative="1">
+    <w:tmpl w:val="8CA04DD2"/>
+    <w:lvl w:ilvl="0" w:tplc="C7908CE2" w:tentative="1">
       <w:start w:val="1"/>
       <w:numFmt w:val="bullet"/>
       <w:lvlText w:val="●"/>
@@ -6443,7 +6459,7 @@
         <w:ind w:left="720" w:hanging="360"/>
       </w:pPr>
     </w:lvl>
-    <w:lvl w:ilvl="1" w:tplc="F4922FBC" w:tentative="1">
+    <w:lvl w:ilvl="1" w:tplc="65502BBE" w:tentative="1">
       <w:start w:val="1"/>
       <w:numFmt w:val="bullet"/>
       <w:lvlText w:val="○"/>
@@ -6452,7 +6468,7 @@
         <w:ind w:left="1440" w:hanging="360"/>
       </w:pPr>
     </w:lvl>
-    <w:lvl w:ilvl="2" w:tplc="97BA5738" w:tentative="1">
+    <w:lvl w:ilvl="2" w:tplc="67A82216" w:tentative="1">
       <w:start w:val="1"/>
       <w:numFmt w:val="bullet"/>
       <w:lvlText w:val="■"/>
@@ -6461,7 +6477,7 @@
         <w:ind w:left="2160" w:hanging="360"/>
       </w:pPr>
     </w:lvl>
-    <w:lvl w:ilvl="3" w:tplc="84A893D8" w:tentative="1">
+    <w:lvl w:ilvl="3" w:tplc="22CA16D6" w:tentative="1">
       <w:start w:val="1"/>
       <w:numFmt w:val="bullet"/>
       <w:lvlText w:val="●"/>
@@ -6470,7 +6486,7 @@
         <w:ind w:left="2880" w:hanging="360"/>
       </w:pPr>
     </w:lvl>
-    <w:lvl w:ilvl="4" w:tplc="3F200BBE" w:tentative="1">
+    <w:lvl w:ilvl="4" w:tplc="4E5ECFE8" w:tentative="1">
       <w:start w:val="1"/>
       <w:numFmt w:val="bullet"/>
       <w:lvlText w:val="○"/>
@@ -6479,7 +6495,7 @@
         <w:ind w:left="3600" w:hanging="360"/>
       </w:pPr>
     </w:lvl>
-    <w:lvl w:ilvl="5" w:tplc="C56A10AA" w:tentative="1">
+    <w:lvl w:ilvl="5" w:tplc="B588DB90" w:tentative="1">
       <w:start w:val="1"/>
       <w:numFmt w:val="bullet"/>
       <w:lvlText w:val="■"/>
@@ -6488,7 +6504,7 @@
         <w:ind w:left="4320" w:hanging="360"/>
       </w:pPr>
     </w:lvl>
-    <w:lvl w:ilvl="6" w:tplc="87B843B4" w:tentative="1">
+    <w:lvl w:ilvl="6" w:tplc="DF381C84" w:tentative="1">
       <w:start w:val="1"/>
       <w:numFmt w:val="bullet"/>
       <w:lvlText w:val="●"/>
@@ -6497,7 +6513,7 @@
         <w:ind w:left="5040" w:hanging="360"/>
       </w:pPr>
     </w:lvl>
-    <w:lvl w:ilvl="7" w:tplc="ACA819EC" w:tentative="1">
+    <w:lvl w:ilvl="7" w:tplc="476C7482" w:tentative="1">
       <w:start w:val="1"/>
       <w:numFmt w:val="bullet"/>
       <w:lvlText w:val="●"/>
@@ -6506,7 +6522,7 @@
         <w:ind w:left="5760" w:hanging="360"/>
       </w:pPr>
     </w:lvl>
-    <w:lvl w:ilvl="8" w:tplc="C018E330" w:tentative="1">
+    <w:lvl w:ilvl="8" w:tplc="13B0A738" w:tentative="1">
       <w:start w:val="1"/>
       <w:numFmt w:val="bullet"/>
       <w:lvlText w:val="●"/>
@@ -6517,77 +6533,73 @@
     </w:lvl>
   </w:abstractNum>
   <w:abstractNum w:abstractNumId="2" w15:restartNumberingAfterBreak="0">
-    <w:nsid w:val="69BC2D22"/>
+    <w:nsid w:val="65374634"/>
     <w:multiLevelType w:val="hybridMultilevel"/>
-    <w:tmpl w:val="4822CFE2"/>
-    <w:lvl w:ilvl="0" w:tplc="B254AEF8">
+    <w:tmpl w:val="1B144A88"/>
+    <w:lvl w:ilvl="0" w:tplc="9E98D596">
       <w:start w:val="1"/>
-      <w:numFmt w:val="bullet"/>
-      <w:lvlText w:val="•"/>
+      <w:numFmt w:val="decimal"/>
+      <w:lvlText w:val="%1."/>
       <w:lvlJc w:val="left"/>
       <w:pPr>
-        <w:ind w:left="540" w:hanging="270"/>
+        <w:ind w:left="540" w:hanging="360"/>
       </w:pPr>
     </w:lvl>
-    <w:lvl w:ilvl="1" w:tplc="EC4A94BE">
-      <w:start w:val="1"/>
-      <w:numFmt w:val="bullet"/>
-      <w:lvlText w:val="–"/>
-      <w:lvlJc w:val="left"/>
-      <w:pPr>
-        <w:ind w:left="1080" w:hanging="270"/>
-      </w:pPr>
-    </w:lvl>
-    <w:lvl w:ilvl="2" w:tplc="DCA421CA">
+    <w:lvl w:ilvl="1" w:tplc="9746CDAC">
       <w:numFmt w:val="decimal"/>
       <w:lvlText w:val=""/>
       <w:lvlJc w:val="left"/>
     </w:lvl>
-    <w:lvl w:ilvl="3" w:tplc="BC9C4CD8">
+    <w:lvl w:ilvl="2" w:tplc="E3CE1CDE">
       <w:numFmt w:val="decimal"/>
       <w:lvlText w:val=""/>
       <w:lvlJc w:val="left"/>
     </w:lvl>
-    <w:lvl w:ilvl="4" w:tplc="80EEB44E">
+    <w:lvl w:ilvl="3" w:tplc="EAB0EFEC">
       <w:numFmt w:val="decimal"/>
       <w:lvlText w:val=""/>
       <w:lvlJc w:val="left"/>
     </w:lvl>
-    <w:lvl w:ilvl="5" w:tplc="B5284D58">
+    <w:lvl w:ilvl="4" w:tplc="F71811C0">
       <w:numFmt w:val="decimal"/>
       <w:lvlText w:val=""/>
       <w:lvlJc w:val="left"/>
     </w:lvl>
-    <w:lvl w:ilvl="6" w:tplc="88C8C0F4">
+    <w:lvl w:ilvl="5" w:tplc="798A0F5C">
       <w:numFmt w:val="decimal"/>
       <w:lvlText w:val=""/>
       <w:lvlJc w:val="left"/>
     </w:lvl>
-    <w:lvl w:ilvl="7" w:tplc="EC5AE9A4">
+    <w:lvl w:ilvl="6" w:tplc="8ABCD0EC">
       <w:numFmt w:val="decimal"/>
       <w:lvlText w:val=""/>
       <w:lvlJc w:val="left"/>
     </w:lvl>
-    <w:lvl w:ilvl="8" w:tplc="BF8E49B0">
+    <w:lvl w:ilvl="7" w:tplc="AC885002">
+      <w:numFmt w:val="decimal"/>
+      <w:lvlText w:val=""/>
+      <w:lvlJc w:val="left"/>
+    </w:lvl>
+    <w:lvl w:ilvl="8" w:tplc="E072EF54">
       <w:numFmt w:val="decimal"/>
       <w:lvlText w:val=""/>
       <w:lvlJc w:val="left"/>
     </w:lvl>
   </w:abstractNum>
-  <w:num w:numId="1" w16cid:durableId="220790927">
+  <w:num w:numId="1" w16cid:durableId="939993543">
     <w:abstractNumId w:val="1"/>
     <w:lvlOverride w:ilvl="0">
       <w:startOverride w:val="1"/>
     </w:lvlOverride>
   </w:num>
-  <w:num w:numId="2" w16cid:durableId="359400014">
-    <w:abstractNumId w:val="0"/>
+  <w:num w:numId="2" w16cid:durableId="2070808937">
+    <w:abstractNumId w:val="2"/>
     <w:lvlOverride w:ilvl="0">
       <w:startOverride w:val="1"/>
     </w:lvlOverride>
   </w:num>
-  <w:num w:numId="3" w16cid:durableId="1600068490">
-    <w:abstractNumId w:val="2"/>
+  <w:num w:numId="3" w16cid:durableId="810290465">
+    <w:abstractNumId w:val="0"/>
     <w:lvlOverride w:ilvl="0">
       <w:startOverride w:val="1"/>
     </w:lvlOverride>

</xml_diff>

<commit_message>
Help Desk: live customer request page, assign tickets to Shopify staff
The request page now checks every few seconds (public messages only) and
swaps in new team replies without a reload, with a notice; customer replies
send in the background, and the plain form still works without JavaScript.
Staff who open the Help Desk are recorded from Shopify's online session (no
Plus-only scope needed), can be assigned tickets, can be turned off in
Settings > Team, and replies default to the signed-in staff member. Enables
online tokens alongside the offline token. Adds tests and updates guides.

Co-Authored-By: Claude Opus 5.5 <noreply@anthropic.com>
</commit_message>
<xml_diff>
--- a/docs/Help-Desk-User-Guide-English.docx
+++ b/docs/Help-Desk-User-Guide-English.docx
@@ -104,7 +104,7 @@
     <w:sdt>
       <w:sdtPr>
         <w:alias w:val="Contents"/>
-        <w:id w:val="-9455883"/>
+        <w:id w:val="-508450277"/>
       </w:sdtPr>
       <w:sdtEndPr/>
       <w:sdtContent>
@@ -132,7 +132,7 @@
           <w:r>
             <w:fldChar w:fldCharType="separate"/>
           </w:r>
-          <w:hyperlink w:anchor="_Toc243646116" w:history="1">
+          <w:hyperlink w:anchor="_Toc243646776" w:history="1">
             <w:r>
               <w:rPr>
                 <w:rStyle w:val="Hyperlink"/>
@@ -156,7 +156,7 @@
               <w:rPr>
                 <w:noProof/>
               </w:rPr>
-              <w:instrText xml:space="preserve"> PAGEREF _Toc243646116 \h </w:instrText>
+              <w:instrText xml:space="preserve"> PAGEREF _Toc243646776 \h </w:instrText>
             </w:r>
             <w:r>
               <w:rPr>
@@ -198,7 +198,7 @@
               <w14:ligatures w14:val="standardContextual"/>
             </w:rPr>
           </w:pPr>
-          <w:hyperlink w:anchor="_Toc243646117" w:history="1">
+          <w:hyperlink w:anchor="_Toc243646777" w:history="1">
             <w:r>
               <w:rPr>
                 <w:rStyle w:val="Hyperlink"/>
@@ -222,7 +222,7 @@
               <w:rPr>
                 <w:noProof/>
               </w:rPr>
-              <w:instrText xml:space="preserve"> PAGEREF _Toc243646117 \h </w:instrText>
+              <w:instrText xml:space="preserve"> PAGEREF _Toc243646777 \h </w:instrText>
             </w:r>
             <w:r>
               <w:rPr>
@@ -264,7 +264,7 @@
               <w14:ligatures w14:val="standardContextual"/>
             </w:rPr>
           </w:pPr>
-          <w:hyperlink w:anchor="_Toc243646118" w:history="1">
+          <w:hyperlink w:anchor="_Toc243646778" w:history="1">
             <w:r>
               <w:rPr>
                 <w:rStyle w:val="Hyperlink"/>
@@ -288,7 +288,7 @@
               <w:rPr>
                 <w:noProof/>
               </w:rPr>
-              <w:instrText xml:space="preserve"> PAGEREF _Toc243646118 \h </w:instrText>
+              <w:instrText xml:space="preserve"> PAGEREF _Toc243646778 \h </w:instrText>
             </w:r>
             <w:r>
               <w:rPr>
@@ -330,7 +330,7 @@
               <w14:ligatures w14:val="standardContextual"/>
             </w:rPr>
           </w:pPr>
-          <w:hyperlink w:anchor="_Toc243646119" w:history="1">
+          <w:hyperlink w:anchor="_Toc243646779" w:history="1">
             <w:r>
               <w:rPr>
                 <w:rStyle w:val="Hyperlink"/>
@@ -354,7 +354,7 @@
               <w:rPr>
                 <w:noProof/>
               </w:rPr>
-              <w:instrText xml:space="preserve"> PAGEREF _Toc243646119 \h </w:instrText>
+              <w:instrText xml:space="preserve"> PAGEREF _Toc243646779 \h </w:instrText>
             </w:r>
             <w:r>
               <w:rPr>
@@ -396,7 +396,7 @@
               <w14:ligatures w14:val="standardContextual"/>
             </w:rPr>
           </w:pPr>
-          <w:hyperlink w:anchor="_Toc243646120" w:history="1">
+          <w:hyperlink w:anchor="_Toc243646780" w:history="1">
             <w:r>
               <w:rPr>
                 <w:rStyle w:val="Hyperlink"/>
@@ -420,7 +420,7 @@
               <w:rPr>
                 <w:noProof/>
               </w:rPr>
-              <w:instrText xml:space="preserve"> PAGEREF _Toc243646120 \h </w:instrText>
+              <w:instrText xml:space="preserve"> PAGEREF _Toc243646780 \h </w:instrText>
             </w:r>
             <w:r>
               <w:rPr>
@@ -462,7 +462,7 @@
               <w14:ligatures w14:val="standardContextual"/>
             </w:rPr>
           </w:pPr>
-          <w:hyperlink w:anchor="_Toc243646121" w:history="1">
+          <w:hyperlink w:anchor="_Toc243646781" w:history="1">
             <w:r>
               <w:rPr>
                 <w:rStyle w:val="Hyperlink"/>
@@ -486,7 +486,7 @@
               <w:rPr>
                 <w:noProof/>
               </w:rPr>
-              <w:instrText xml:space="preserve"> PAGEREF _Toc243646121 \h </w:instrText>
+              <w:instrText xml:space="preserve"> PAGEREF _Toc243646781 \h </w:instrText>
             </w:r>
             <w:r>
               <w:rPr>
@@ -528,7 +528,7 @@
               <w14:ligatures w14:val="standardContextual"/>
             </w:rPr>
           </w:pPr>
-          <w:hyperlink w:anchor="_Toc243646122" w:history="1">
+          <w:hyperlink w:anchor="_Toc243646782" w:history="1">
             <w:r>
               <w:rPr>
                 <w:rStyle w:val="Hyperlink"/>
@@ -552,7 +552,7 @@
               <w:rPr>
                 <w:noProof/>
               </w:rPr>
-              <w:instrText xml:space="preserve"> PAGEREF _Toc243646122 \h </w:instrText>
+              <w:instrText xml:space="preserve"> PAGEREF _Toc243646782 \h </w:instrText>
             </w:r>
             <w:r>
               <w:rPr>
@@ -594,7 +594,7 @@
               <w14:ligatures w14:val="standardContextual"/>
             </w:rPr>
           </w:pPr>
-          <w:hyperlink w:anchor="_Toc243646123" w:history="1">
+          <w:hyperlink w:anchor="_Toc243646783" w:history="1">
             <w:r>
               <w:rPr>
                 <w:rStyle w:val="Hyperlink"/>
@@ -618,7 +618,7 @@
               <w:rPr>
                 <w:noProof/>
               </w:rPr>
-              <w:instrText xml:space="preserve"> PAGEREF _Toc243646123 \h </w:instrText>
+              <w:instrText xml:space="preserve"> PAGEREF _Toc243646783 \h </w:instrText>
             </w:r>
             <w:r>
               <w:rPr>
@@ -660,7 +660,7 @@
               <w14:ligatures w14:val="standardContextual"/>
             </w:rPr>
           </w:pPr>
-          <w:hyperlink w:anchor="_Toc243646124" w:history="1">
+          <w:hyperlink w:anchor="_Toc243646784" w:history="1">
             <w:r>
               <w:rPr>
                 <w:rStyle w:val="Hyperlink"/>
@@ -684,7 +684,7 @@
               <w:rPr>
                 <w:noProof/>
               </w:rPr>
-              <w:instrText xml:space="preserve"> PAGEREF _Toc243646124 \h </w:instrText>
+              <w:instrText xml:space="preserve"> PAGEREF _Toc243646784 \h </w:instrText>
             </w:r>
             <w:r>
               <w:rPr>
@@ -701,7 +701,7 @@
               <w:rPr>
                 <w:noProof/>
               </w:rPr>
-              <w:t>4</w:t>
+              <w:t>5</w:t>
             </w:r>
             <w:r>
               <w:rPr>
@@ -726,7 +726,7 @@
               <w14:ligatures w14:val="standardContextual"/>
             </w:rPr>
           </w:pPr>
-          <w:hyperlink w:anchor="_Toc243646125" w:history="1">
+          <w:hyperlink w:anchor="_Toc243646785" w:history="1">
             <w:r>
               <w:rPr>
                 <w:rStyle w:val="Hyperlink"/>
@@ -750,7 +750,7 @@
               <w:rPr>
                 <w:noProof/>
               </w:rPr>
-              <w:instrText xml:space="preserve"> PAGEREF _Toc243646125 \h </w:instrText>
+              <w:instrText xml:space="preserve"> PAGEREF _Toc243646785 \h </w:instrText>
             </w:r>
             <w:r>
               <w:rPr>
@@ -792,7 +792,7 @@
               <w14:ligatures w14:val="standardContextual"/>
             </w:rPr>
           </w:pPr>
-          <w:hyperlink w:anchor="_Toc243646126" w:history="1">
+          <w:hyperlink w:anchor="_Toc243646786" w:history="1">
             <w:r>
               <w:rPr>
                 <w:rStyle w:val="Hyperlink"/>
@@ -816,7 +816,7 @@
               <w:rPr>
                 <w:noProof/>
               </w:rPr>
-              <w:instrText xml:space="preserve"> PAGEREF _Toc243646126 \h </w:instrText>
+              <w:instrText xml:space="preserve"> PAGEREF _Toc243646786 \h </w:instrText>
             </w:r>
             <w:r>
               <w:rPr>
@@ -858,7 +858,7 @@
               <w14:ligatures w14:val="standardContextual"/>
             </w:rPr>
           </w:pPr>
-          <w:hyperlink w:anchor="_Toc243646127" w:history="1">
+          <w:hyperlink w:anchor="_Toc243646787" w:history="1">
             <w:r>
               <w:rPr>
                 <w:rStyle w:val="Hyperlink"/>
@@ -882,7 +882,7 @@
               <w:rPr>
                 <w:noProof/>
               </w:rPr>
-              <w:instrText xml:space="preserve"> PAGEREF _Toc243646127 \h </w:instrText>
+              <w:instrText xml:space="preserve"> PAGEREF _Toc243646787 \h </w:instrText>
             </w:r>
             <w:r>
               <w:rPr>
@@ -924,7 +924,7 @@
               <w14:ligatures w14:val="standardContextual"/>
             </w:rPr>
           </w:pPr>
-          <w:hyperlink w:anchor="_Toc243646128" w:history="1">
+          <w:hyperlink w:anchor="_Toc243646788" w:history="1">
             <w:r>
               <w:rPr>
                 <w:rStyle w:val="Hyperlink"/>
@@ -948,7 +948,7 @@
               <w:rPr>
                 <w:noProof/>
               </w:rPr>
-              <w:instrText xml:space="preserve"> PAGEREF _Toc243646128 \h </w:instrText>
+              <w:instrText xml:space="preserve"> PAGEREF _Toc243646788 \h </w:instrText>
             </w:r>
             <w:r>
               <w:rPr>
@@ -965,7 +965,7 @@
               <w:rPr>
                 <w:noProof/>
               </w:rPr>
-              <w:t>5</w:t>
+              <w:t>6</w:t>
             </w:r>
             <w:r>
               <w:rPr>
@@ -990,7 +990,7 @@
               <w14:ligatures w14:val="standardContextual"/>
             </w:rPr>
           </w:pPr>
-          <w:hyperlink w:anchor="_Toc243646129" w:history="1">
+          <w:hyperlink w:anchor="_Toc243646789" w:history="1">
             <w:r>
               <w:rPr>
                 <w:rStyle w:val="Hyperlink"/>
@@ -1014,7 +1014,7 @@
               <w:rPr>
                 <w:noProof/>
               </w:rPr>
-              <w:instrText xml:space="preserve"> PAGEREF _Toc243646129 \h </w:instrText>
+              <w:instrText xml:space="preserve"> PAGEREF _Toc243646789 \h </w:instrText>
             </w:r>
             <w:r>
               <w:rPr>
@@ -1056,7 +1056,7 @@
               <w14:ligatures w14:val="standardContextual"/>
             </w:rPr>
           </w:pPr>
-          <w:hyperlink w:anchor="_Toc243646130" w:history="1">
+          <w:hyperlink w:anchor="_Toc243646790" w:history="1">
             <w:r>
               <w:rPr>
                 <w:rStyle w:val="Hyperlink"/>
@@ -1080,7 +1080,7 @@
               <w:rPr>
                 <w:noProof/>
               </w:rPr>
-              <w:instrText xml:space="preserve"> PAGEREF _Toc243646130 \h </w:instrText>
+              <w:instrText xml:space="preserve"> PAGEREF _Toc243646790 \h </w:instrText>
             </w:r>
             <w:r>
               <w:rPr>
@@ -1097,7 +1097,7 @@
               <w:rPr>
                 <w:noProof/>
               </w:rPr>
-              <w:t>6</w:t>
+              <w:t>7</w:t>
             </w:r>
             <w:r>
               <w:rPr>
@@ -1122,7 +1122,7 @@
               <w14:ligatures w14:val="standardContextual"/>
             </w:rPr>
           </w:pPr>
-          <w:hyperlink w:anchor="_Toc243646131" w:history="1">
+          <w:hyperlink w:anchor="_Toc243646791" w:history="1">
             <w:r>
               <w:rPr>
                 <w:rStyle w:val="Hyperlink"/>
@@ -1146,7 +1146,7 @@
               <w:rPr>
                 <w:noProof/>
               </w:rPr>
-              <w:instrText xml:space="preserve"> PAGEREF _Toc243646131 \h </w:instrText>
+              <w:instrText xml:space="preserve"> PAGEREF _Toc243646791 \h </w:instrText>
             </w:r>
             <w:r>
               <w:rPr>
@@ -1188,7 +1188,7 @@
               <w14:ligatures w14:val="standardContextual"/>
             </w:rPr>
           </w:pPr>
-          <w:hyperlink w:anchor="_Toc243646132" w:history="1">
+          <w:hyperlink w:anchor="_Toc243646792" w:history="1">
             <w:r>
               <w:rPr>
                 <w:rStyle w:val="Hyperlink"/>
@@ -1212,7 +1212,7 @@
               <w:rPr>
                 <w:noProof/>
               </w:rPr>
-              <w:instrText xml:space="preserve"> PAGEREF _Toc243646132 \h </w:instrText>
+              <w:instrText xml:space="preserve"> PAGEREF _Toc243646792 \h </w:instrText>
             </w:r>
             <w:r>
               <w:rPr>
@@ -1254,7 +1254,7 @@
               <w14:ligatures w14:val="standardContextual"/>
             </w:rPr>
           </w:pPr>
-          <w:hyperlink w:anchor="_Toc243646133" w:history="1">
+          <w:hyperlink w:anchor="_Toc243646793" w:history="1">
             <w:r>
               <w:rPr>
                 <w:rStyle w:val="Hyperlink"/>
@@ -1278,7 +1278,7 @@
               <w:rPr>
                 <w:noProof/>
               </w:rPr>
-              <w:instrText xml:space="preserve"> PAGEREF _Toc243646133 \h </w:instrText>
+              <w:instrText xml:space="preserve"> PAGEREF _Toc243646793 \h </w:instrText>
             </w:r>
             <w:r>
               <w:rPr>
@@ -1320,7 +1320,7 @@
               <w14:ligatures w14:val="standardContextual"/>
             </w:rPr>
           </w:pPr>
-          <w:hyperlink w:anchor="_Toc243646134" w:history="1">
+          <w:hyperlink w:anchor="_Toc243646794" w:history="1">
             <w:r>
               <w:rPr>
                 <w:rStyle w:val="Hyperlink"/>
@@ -1344,7 +1344,7 @@
               <w:rPr>
                 <w:noProof/>
               </w:rPr>
-              <w:instrText xml:space="preserve"> PAGEREF _Toc243646134 \h </w:instrText>
+              <w:instrText xml:space="preserve"> PAGEREF _Toc243646794 \h </w:instrText>
             </w:r>
             <w:r>
               <w:rPr>
@@ -1386,7 +1386,7 @@
               <w14:ligatures w14:val="standardContextual"/>
             </w:rPr>
           </w:pPr>
-          <w:hyperlink w:anchor="_Toc243646135" w:history="1">
+          <w:hyperlink w:anchor="_Toc243646795" w:history="1">
             <w:r>
               <w:rPr>
                 <w:rStyle w:val="Hyperlink"/>
@@ -1410,7 +1410,7 @@
               <w:rPr>
                 <w:noProof/>
               </w:rPr>
-              <w:instrText xml:space="preserve"> PAGEREF _Toc243646135 \h </w:instrText>
+              <w:instrText xml:space="preserve"> PAGEREF _Toc243646795 \h </w:instrText>
             </w:r>
             <w:r>
               <w:rPr>
@@ -1427,7 +1427,7 @@
               <w:rPr>
                 <w:noProof/>
               </w:rPr>
-              <w:t>8</w:t>
+              <w:t>9</w:t>
             </w:r>
             <w:r>
               <w:rPr>
@@ -1452,7 +1452,7 @@
               <w14:ligatures w14:val="standardContextual"/>
             </w:rPr>
           </w:pPr>
-          <w:hyperlink w:anchor="_Toc243646136" w:history="1">
+          <w:hyperlink w:anchor="_Toc243646796" w:history="1">
             <w:r>
               <w:rPr>
                 <w:rStyle w:val="Hyperlink"/>
@@ -1476,7 +1476,7 @@
               <w:rPr>
                 <w:noProof/>
               </w:rPr>
-              <w:instrText xml:space="preserve"> PAGEREF _Toc243646136 \h </w:instrText>
+              <w:instrText xml:space="preserve"> PAGEREF _Toc243646796 \h </w:instrText>
             </w:r>
             <w:r>
               <w:rPr>
@@ -1493,7 +1493,7 @@
               <w:rPr>
                 <w:noProof/>
               </w:rPr>
-              <w:t>8</w:t>
+              <w:t>9</w:t>
             </w:r>
             <w:r>
               <w:rPr>
@@ -1518,7 +1518,7 @@
               <w14:ligatures w14:val="standardContextual"/>
             </w:rPr>
           </w:pPr>
-          <w:hyperlink w:anchor="_Toc243646137" w:history="1">
+          <w:hyperlink w:anchor="_Toc243646797" w:history="1">
             <w:r>
               <w:rPr>
                 <w:rStyle w:val="Hyperlink"/>
@@ -1542,7 +1542,7 @@
               <w:rPr>
                 <w:noProof/>
               </w:rPr>
-              <w:instrText xml:space="preserve"> PAGEREF _Toc243646137 \h </w:instrText>
+              <w:instrText xml:space="preserve"> PAGEREF _Toc243646797 \h </w:instrText>
             </w:r>
             <w:r>
               <w:rPr>
@@ -1584,7 +1584,7 @@
               <w14:ligatures w14:val="standardContextual"/>
             </w:rPr>
           </w:pPr>
-          <w:hyperlink w:anchor="_Toc243646138" w:history="1">
+          <w:hyperlink w:anchor="_Toc243646798" w:history="1">
             <w:r>
               <w:rPr>
                 <w:rStyle w:val="Hyperlink"/>
@@ -1608,7 +1608,7 @@
               <w:rPr>
                 <w:noProof/>
               </w:rPr>
-              <w:instrText xml:space="preserve"> PAGEREF _Toc243646138 \h </w:instrText>
+              <w:instrText xml:space="preserve"> PAGEREF _Toc243646798 \h </w:instrText>
             </w:r>
             <w:r>
               <w:rPr>
@@ -1651,7 +1651,7 @@
       <w:pPr>
         <w:pStyle w:val="Heading1"/>
       </w:pPr>
-      <w:bookmarkStart w:id="0" w:name="_Toc243646116"/>
+      <w:bookmarkStart w:id="0" w:name="_Toc243646776"/>
       <w:r>
         <w:t>1. What the Help Desk does</w:t>
       </w:r>
@@ -2132,7 +2132,7 @@
       <w:pPr>
         <w:pStyle w:val="Heading2"/>
       </w:pPr>
-      <w:bookmarkStart w:id="1" w:name="_Toc243646117"/>
+      <w:bookmarkStart w:id="1" w:name="_Toc243646777"/>
       <w:r>
         <w:t>The flow in one line</w:t>
       </w:r>
@@ -2150,7 +2150,7 @@
       <w:pPr>
         <w:pStyle w:val="Heading2"/>
       </w:pPr>
-      <w:bookmarkStart w:id="2" w:name="_Toc243646118"/>
+      <w:bookmarkStart w:id="2" w:name="_Toc243646778"/>
       <w:r>
         <w:t>Ticket statuses</w:t>
       </w:r>
@@ -2463,7 +2463,7 @@
       <w:pPr>
         <w:pStyle w:val="Heading1"/>
       </w:pPr>
-      <w:bookmarkStart w:id="3" w:name="_Toc243646119"/>
+      <w:bookmarkStart w:id="3" w:name="_Toc243646779"/>
       <w:r>
         <w:t>2. First-time setup (on each store)</w:t>
       </w:r>
@@ -2524,7 +2524,47 @@
         <w:t>Team and signature.</w:t>
       </w:r>
       <w:r>
-        <w:t xml:space="preserve"> Help Desk → Settings → enter your team members (for example "Priya, Rahul") and your reply signature → Save.</w:t>
+        <w:t xml:space="preserve"> Ask each staff member with Shopify admin access to open </w:t>
+      </w:r>
+      <w:r>
+        <w:rPr>
+          <w:b/>
+          <w:bCs/>
+        </w:rPr>
+        <w:t>Apps → Zion App → Help Desk</w:t>
+      </w:r>
+      <w:r>
+        <w:t xml:space="preserve"> once: they are added to </w:t>
+      </w:r>
+      <w:r>
+        <w:rPr>
+          <w:b/>
+          <w:bCs/>
+        </w:rPr>
+        <w:t>Settings → Team → Shopify staff</w:t>
+      </w:r>
+      <w:r>
+        <w:t xml:space="preserve"> automatically and can be assigned tickets. Turn a person's switch off to take them off the assign list. Add people without a Shopify login (such as a warehouse team) under </w:t>
+      </w:r>
+      <w:r>
+        <w:rPr>
+          <w:b/>
+          <w:bCs/>
+        </w:rPr>
+        <w:t>Other names</w:t>
+      </w:r>
+      <w:r>
+        <w:t xml:space="preserve">, separated by commas. Then add your reply signature under Settings → </w:t>
+      </w:r>
+      <w:r>
+        <w:rPr>
+          <w:b/>
+          <w:bCs/>
+        </w:rPr>
+        <w:t>Emails</w:t>
+      </w:r>
+      <w:r>
+        <w:t xml:space="preserve"> → Save.</w:t>
       </w:r>
     </w:p>
     <w:p>
@@ -2621,7 +2661,7 @@
       <w:pPr>
         <w:pStyle w:val="Heading1"/>
       </w:pPr>
-      <w:bookmarkStart w:id="4" w:name="_Toc243646120"/>
+      <w:bookmarkStart w:id="4" w:name="_Toc243646780"/>
       <w:r>
         <w:t>3. What the customer sees</w:t>
       </w:r>
@@ -2631,7 +2671,7 @@
       <w:pPr>
         <w:pStyle w:val="Heading2"/>
       </w:pPr>
-      <w:bookmarkStart w:id="5" w:name="_Toc243646121"/>
+      <w:bookmarkStart w:id="5" w:name="_Toc243646781"/>
       <w:r>
         <w:t>Sending the form</w:t>
       </w:r>
@@ -2720,7 +2760,7 @@
       <w:pPr>
         <w:pStyle w:val="Heading2"/>
       </w:pPr>
-      <w:bookmarkStart w:id="6" w:name="_Toc243646122"/>
+      <w:bookmarkStart w:id="6" w:name="_Toc243646782"/>
       <w:r>
         <w:t>The request page</w:t>
       </w:r>
@@ -2769,7 +2809,7 @@
         <w:t>Add a message</w:t>
       </w:r>
       <w:r>
-        <w:t xml:space="preserve"> only opens when your team has replied (status "Waiting on customer"). The customer can then answer with text and up to 3 photos.</w:t>
+        <w:t xml:space="preserve"> only opens when your team has replied (status "Waiting on customer"). The customer can then answer with text and up to 3 photos, and it sends without reloading the page.</w:t>
       </w:r>
     </w:p>
     <w:p>
@@ -2782,7 +2822,14 @@
         <w:spacing w:after="60"/>
       </w:pPr>
       <w:r>
-        <w:t>Internal notes and the activity log are never shown to the customer.</w:t>
+        <w:rPr>
+          <w:b/>
+          <w:bCs/>
+        </w:rPr>
+        <w:t>Live like a chat:</w:t>
+      </w:r>
+      <w:r>
+        <w:t xml:space="preserve"> the page checks for news every few seconds. A team reply appears without a reload, with a "New message from our team" notice. Internal notes never appear there.</w:t>
       </w:r>
     </w:p>
     <w:p>
@@ -2795,28 +2842,8 @@
         <w:spacing w:after="60"/>
       </w:pPr>
       <w:r>
-        <w:t>Lost the link? The customer can open /apps/help-desk?ticket= and look the request up with its number and their email. After 5 wrong tries it locks for 15 minutes.</w:t>
-      </w:r>
-    </w:p>
-    <w:p>
-      <w:pPr>
-        <w:pStyle w:val="Heading1"/>
-      </w:pPr>
-      <w:bookmarkStart w:id="7" w:name="_Toc243646123"/>
-      <w:r>
-        <w:t>4. Daily work: inbox and tickets</w:t>
-      </w:r>
-      <w:bookmarkEnd w:id="7"/>
-    </w:p>
-    <w:p>
-      <w:pPr>
-        <w:pStyle w:val="Heading2"/>
-      </w:pPr>
-      <w:bookmarkStart w:id="8" w:name="_Toc243646124"/>
-      <w:r>
-        <w:t>The inbox</w:t>
-      </w:r>
-      <w:bookmarkEnd w:id="8"/>
+        <w:t>Internal notes and the activity log are never shown to the customer.</w:t>
+      </w:r>
     </w:p>
     <w:p>
       <w:pPr>
@@ -2828,25 +2855,28 @@
         <w:spacing w:after="60"/>
       </w:pPr>
       <w:r>
-        <w:rPr>
-          <w:b/>
-          <w:bCs/>
-        </w:rPr>
-        <w:t>Four boxes at the top:</w:t>
-      </w:r>
-      <w:r>
-        <w:t xml:space="preserve"> Needs attention, Waiting on customer, High priority and Flagged photos. Click a box to see those tickets. While setup is unfinished, a "Finish setting up" banner links to the steps left. Full numbers and the setup checklist are on the </w:t>
-      </w:r>
-      <w:r>
-        <w:rPr>
-          <w:b/>
-          <w:bCs/>
-        </w:rPr>
-        <w:t>Overview &amp; setup</w:t>
-      </w:r>
-      <w:r>
-        <w:t xml:space="preserve"> tab.</w:t>
-      </w:r>
+        <w:t>Lost the link? The customer can open /apps/help-desk?ticket= and look the request up with its number and their email. After 5 wrong tries it locks for 15 minutes.</w:t>
+      </w:r>
+    </w:p>
+    <w:p>
+      <w:pPr>
+        <w:pStyle w:val="Heading1"/>
+      </w:pPr>
+      <w:bookmarkStart w:id="7" w:name="_Toc243646783"/>
+      <w:r>
+        <w:t>4. Daily work: inbox and tickets</w:t>
+      </w:r>
+      <w:bookmarkEnd w:id="7"/>
+    </w:p>
+    <w:p>
+      <w:pPr>
+        <w:pStyle w:val="Heading2"/>
+      </w:pPr>
+      <w:bookmarkStart w:id="8" w:name="_Toc243646784"/>
+      <w:r>
+        <w:t>The inbox</w:t>
+      </w:r>
+      <w:bookmarkEnd w:id="8"/>
     </w:p>
     <w:p>
       <w:pPr>
@@ -2862,10 +2892,20 @@
           <w:b/>
           <w:bCs/>
         </w:rPr>
-        <w:t>View tabs:</w:t>
-      </w:r>
-      <w:r>
-        <w:t xml:space="preserve"> Needs attention · Waiting on customer · Resolved · All tickets, then Unassigned · High priority · Flagged photos, each with its count.</w:t>
+        <w:t>Four boxes at the top:</w:t>
+      </w:r>
+      <w:r>
+        <w:t xml:space="preserve"> Needs attention, Waiting on customer, High priority and Flagged photos. Click a box to see those tickets. While setup is unfinished, a "Finish setting up" banner links to the steps left. Full numbers and the setup checklist are on the </w:t>
+      </w:r>
+      <w:r>
+        <w:rPr>
+          <w:b/>
+          <w:bCs/>
+        </w:rPr>
+        <w:t>Overview &amp; setup</w:t>
+      </w:r>
+      <w:r>
+        <w:t xml:space="preserve"> tab.</w:t>
       </w:r>
     </w:p>
     <w:p>
@@ -2882,20 +2922,10 @@
           <w:b/>
           <w:bCs/>
         </w:rPr>
-        <w:t>Search</w:t>
-      </w:r>
-      <w:r>
-        <w:t xml:space="preserve"> by #number, name, email, order number or tag. Click </w:t>
-      </w:r>
-      <w:r>
-        <w:rPr>
-          <w:b/>
-          <w:bCs/>
-        </w:rPr>
-        <w:t>Filters</w:t>
-      </w:r>
-      <w:r>
-        <w:t xml:space="preserve"> for topic, priority, assignee and date; active filters show as chips you can remove. Sort sits next to the search.</w:t>
+        <w:t>View tabs:</w:t>
+      </w:r>
+      <w:r>
+        <w:t xml:space="preserve"> Needs attention · Waiting on customer · Resolved · All tickets, then Unassigned · High priority · Flagged photos, each with its count.</w:t>
       </w:r>
     </w:p>
     <w:p>
@@ -2912,10 +2942,20 @@
           <w:b/>
           <w:bCs/>
         </w:rPr>
-        <w:t>Row labels:</w:t>
-      </w:r>
-      <w:r>
-        <w:t xml:space="preserve"> "New" means nobody has opened it yet. "AI photo" or "Reused photo" means a photo needs a closer look. A red "No reply yet · 5h" means the first reply is overdue.</w:t>
+        <w:t>Search</w:t>
+      </w:r>
+      <w:r>
+        <w:t xml:space="preserve"> by #number, name, email, order number or tag. Click </w:t>
+      </w:r>
+      <w:r>
+        <w:rPr>
+          <w:b/>
+          <w:bCs/>
+        </w:rPr>
+        <w:t>Filters</w:t>
+      </w:r>
+      <w:r>
+        <w:t xml:space="preserve"> for topic, priority, assignee and date; active filters show as chips you can remove. Sort sits next to the search.</w:t>
       </w:r>
     </w:p>
     <w:p>
@@ -2932,10 +2972,10 @@
           <w:b/>
           <w:bCs/>
         </w:rPr>
-        <w:t>Bulk actions:</w:t>
-      </w:r>
-      <w:r>
-        <w:t xml:space="preserve"> tick one or more tickets to change status, priority or assignee together, or delete them.</w:t>
+        <w:t>Row labels:</w:t>
+      </w:r>
+      <w:r>
+        <w:t xml:space="preserve"> "New" means nobody has opened it yet. "AI photo" or "Reused photo" means a photo needs a closer look. A red "No reply yet · 5h" means the first reply is overdue.</w:t>
       </w:r>
     </w:p>
     <w:p>
@@ -2948,14 +2988,34 @@
         <w:spacing w:after="60"/>
       </w:pPr>
       <w:r>
-        <w:t>The inbox and an open ticket update by themselves every few seconds. What you're typing is never lost.</w:t>
+        <w:rPr>
+          <w:b/>
+          <w:bCs/>
+        </w:rPr>
+        <w:t>Bulk actions:</w:t>
+      </w:r>
+      <w:r>
+        <w:t xml:space="preserve"> tick one or more tickets to change status, priority or assignee together, or delete them.</w:t>
+      </w:r>
+    </w:p>
+    <w:p>
+      <w:pPr>
+        <w:pStyle w:val="ListParagraph"/>
+        <w:numPr>
+          <w:ilvl w:val="0"/>
+          <w:numId w:val="3"/>
+        </w:numPr>
+        <w:spacing w:after="60"/>
+      </w:pPr>
+      <w:r>
+        <w:t>The inbox and an open ticket update by themselves every few seconds, like a chat, with a notice when the customer writes. What you're typing is never lost.</w:t>
       </w:r>
     </w:p>
     <w:p>
       <w:pPr>
         <w:pStyle w:val="Heading2"/>
       </w:pPr>
-      <w:bookmarkStart w:id="9" w:name="_Toc243646125"/>
+      <w:bookmarkStart w:id="9" w:name="_Toc243646785"/>
       <w:r>
         <w:t>Working a ticket</w:t>
       </w:r>
@@ -2998,7 +3058,37 @@
         <w:t>Write the reply.</w:t>
       </w:r>
       <w:r>
-        <w:t xml:space="preserve"> Choose "Reply to customer". Use </w:t>
+        <w:t xml:space="preserve"> Choose "Reply to customer". Under </w:t>
+      </w:r>
+      <w:r>
+        <w:rPr>
+          <w:b/>
+          <w:bCs/>
+        </w:rPr>
+        <w:t>Send via</w:t>
+      </w:r>
+      <w:r>
+        <w:t xml:space="preserve">, pick where it goes: </w:t>
+      </w:r>
+      <w:r>
+        <w:rPr>
+          <w:b/>
+          <w:bCs/>
+        </w:rPr>
+        <w:t>Request page</w:t>
+      </w:r>
+      <w:r>
+        <w:t xml:space="preserve"> (the default: it appears in the chat on the customer's private page in your store) or </w:t>
+      </w:r>
+      <w:r>
+        <w:rPr>
+          <w:b/>
+          <w:bCs/>
+        </w:rPr>
+        <w:t>Email</w:t>
+      </w:r>
+      <w:r>
+        <w:t xml:space="preserve"> (on the page and in their inbox). WhatsApp and SMS show "Connect" until an account is linked. Use </w:t>
       </w:r>
       <w:r>
         <w:rPr>
@@ -3008,7 +3098,7 @@
         <w:t>Insert a saved reply</w:t>
       </w:r>
       <w:r>
-        <w:t xml:space="preserve"> for a ready answer; placeholders such as {{ customer.first_name }} and {{ order.number }} fill in by themselves. Choosing a different saved reply </w:t>
+        <w:t xml:space="preserve"> for a ready answer; choosing a different one </w:t>
       </w:r>
       <w:r>
         <w:rPr>
@@ -3018,7 +3108,7 @@
         <w:t>replaces</w:t>
       </w:r>
       <w:r>
-        <w:t xml:space="preserve"> the text; it doesn't add to it. Pick your name in </w:t>
+        <w:t xml:space="preserve"> the text. Placeholders such as {{ customer.first_name }} fill in by themselves. </w:t>
       </w:r>
       <w:r>
         <w:rPr>
@@ -3028,7 +3118,7 @@
         <w:t>Reply as</w:t>
       </w:r>
       <w:r>
-        <w:t>.</w:t>
+        <w:t xml:space="preserve"> is set to you, the staff member signed in to Shopify.</w:t>
       </w:r>
     </w:p>
     <w:p>
@@ -3113,7 +3203,7 @@
       <w:pPr>
         <w:pStyle w:val="Heading2"/>
       </w:pPr>
-      <w:bookmarkStart w:id="10" w:name="_Toc243646126"/>
+      <w:bookmarkStart w:id="10" w:name="_Toc243646786"/>
       <w:r>
         <w:t>Which status when</w:t>
       </w:r>
@@ -3391,7 +3481,7 @@
       <w:pPr>
         <w:pStyle w:val="Heading2"/>
       </w:pPr>
-      <w:bookmarkStart w:id="11" w:name="_Toc243646127"/>
+      <w:bookmarkStart w:id="11" w:name="_Toc243646787"/>
       <w:r>
         <w:t>Deleting a ticket</w:t>
       </w:r>
@@ -3429,7 +3519,7 @@
       <w:pPr>
         <w:pStyle w:val="Heading1"/>
       </w:pPr>
-      <w:bookmarkStart w:id="12" w:name="_Toc243646128"/>
+      <w:bookmarkStart w:id="12" w:name="_Toc243646788"/>
       <w:r>
         <w:t>5. AI photo check</w:t>
       </w:r>
@@ -3978,7 +4068,7 @@
       <w:pPr>
         <w:pStyle w:val="Heading2"/>
       </w:pPr>
-      <w:bookmarkStart w:id="13" w:name="_Toc243646129"/>
+      <w:bookmarkStart w:id="13" w:name="_Toc243646789"/>
       <w:r>
         <w:t>What the badge means</w:t>
       </w:r>
@@ -4302,7 +4392,7 @@
       <w:pPr>
         <w:pStyle w:val="Heading2"/>
       </w:pPr>
-      <w:bookmarkStart w:id="14" w:name="_Toc243646130"/>
+      <w:bookmarkStart w:id="14" w:name="_Toc243646790"/>
       <w:r>
         <w:t>Opening the full report</w:t>
       </w:r>
@@ -4643,7 +4733,7 @@
       <w:pPr>
         <w:pStyle w:val="Heading2"/>
       </w:pPr>
-      <w:bookmarkStart w:id="15" w:name="_Toc243646131"/>
+      <w:bookmarkStart w:id="15" w:name="_Toc243646791"/>
       <w:r>
         <w:t>Is the AI detector working?</w:t>
       </w:r>
@@ -5003,7 +5093,7 @@
       <w:pPr>
         <w:pStyle w:val="Heading2"/>
       </w:pPr>
-      <w:bookmarkStart w:id="16" w:name="_Toc243646132"/>
+      <w:bookmarkStart w:id="16" w:name="_Toc243646792"/>
       <w:r>
         <w:t>When the detector runs (Settings → AI photo check)</w:t>
       </w:r>
@@ -5101,7 +5191,7 @@
       <w:pPr>
         <w:pStyle w:val="Heading1"/>
       </w:pPr>
-      <w:bookmarkStart w:id="17" w:name="_Toc243646133"/>
+      <w:bookmarkStart w:id="17" w:name="_Toc243646793"/>
       <w:r>
         <w:t>6. Emails</w:t>
       </w:r>
@@ -5582,7 +5672,7 @@
       <w:pPr>
         <w:pStyle w:val="Heading1"/>
       </w:pPr>
-      <w:bookmarkStart w:id="18" w:name="_Toc243646134"/>
+      <w:bookmarkStart w:id="18" w:name="_Toc243646794"/>
       <w:r>
         <w:t>7. Troubleshooting</w:t>
       </w:r>
@@ -6085,7 +6175,7 @@
       <w:pPr>
         <w:pStyle w:val="Heading1"/>
       </w:pPr>
-      <w:bookmarkStart w:id="19" w:name="_Toc243646135"/>
+      <w:bookmarkStart w:id="19" w:name="_Toc243646795"/>
       <w:r>
         <w:t>8. Quick reference</w:t>
       </w:r>
@@ -6095,7 +6185,7 @@
       <w:pPr>
         <w:pStyle w:val="Heading2"/>
       </w:pPr>
-      <w:bookmarkStart w:id="20" w:name="_Toc243646136"/>
+      <w:bookmarkStart w:id="20" w:name="_Toc243646796"/>
       <w:r>
         <w:t>Every day</w:t>
       </w:r>
@@ -6187,7 +6277,7 @@
       <w:pPr>
         <w:pStyle w:val="Heading2"/>
       </w:pPr>
-      <w:bookmarkStart w:id="21" w:name="_Toc243646137"/>
+      <w:bookmarkStart w:id="21" w:name="_Toc243646797"/>
       <w:r>
         <w:t>Never forget</w:t>
       </w:r>
@@ -6236,7 +6326,7 @@
       <w:pPr>
         <w:pStyle w:val="Heading2"/>
       </w:pPr>
-      <w:bookmarkStart w:id="22" w:name="_Toc243646138"/>
+      <w:bookmarkStart w:id="22" w:name="_Toc243646798"/>
       <w:r>
         <w:t>Still to do</w:t>
       </w:r>
@@ -6389,10 +6479,10 @@
 <file path=word/numbering.xml><?xml version="1.0" encoding="utf-8"?>
 <w:numbering xmlns:wpc="http://schemas.microsoft.com/office/word/2010/wordprocessingCanvas" xmlns:cx="http://schemas.microsoft.com/office/drawing/2014/chartex" xmlns:cx1="http://schemas.microsoft.com/office/drawing/2015/9/8/chartex" xmlns:cx2="http://schemas.microsoft.com/office/drawing/2015/10/21/chartex" xmlns:cx3="http://schemas.microsoft.com/office/drawing/2016/5/9/chartex" xmlns:cx4="http://schemas.microsoft.com/office/drawing/2016/5/10/chartex" xmlns:cx5="http://schemas.microsoft.com/office/drawing/2016/5/11/chartex" xmlns:cx6="http://schemas.microsoft.com/office/drawing/2016/5/12/chartex" xmlns:cx7="http://schemas.microsoft.com/office/drawing/2016/5/13/chartex" xmlns:cx8="http://schemas.microsoft.com/office/drawing/2016/5/14/chartex" xmlns:mc="http://schemas.openxmlformats.org/markup-compatibility/2006" xmlns:aink="http://schemas.microsoft.com/office/drawing/2016/ink" xmlns:am3d="http://schemas.microsoft.com/office/drawing/2017/model3d" xmlns:o="urn:schemas-microsoft-com:office:office" xmlns:oel="http://schemas.microsoft.com/office/2019/extlst" xmlns:r="http://schemas.openxmlformats.org/officeDocument/2006/relationships" xmlns:m="http://schemas.openxmlformats.org/officeDocument/2006/math" xmlns:v="urn:schemas-microsoft-com:vml" xmlns:wp14="http://schemas.microsoft.com/office/word/2010/wordprocessingDrawing" xmlns:wp="http://schemas.openxmlformats.org/drawingml/2006/wordprocessingDrawing" xmlns:w10="urn:schemas-microsoft-com:office:word" xmlns:w="http://schemas.openxmlformats.org/wordprocessingml/2006/main" xmlns:w14="http://schemas.microsoft.com/office/word/2010/wordml" xmlns:w15="http://schemas.microsoft.com/office/word/2012/wordml" xmlns:w16cex="http://schemas.microsoft.com/office/word/2018/wordml/cex" xmlns:w16cid="http://schemas.microsoft.com/office/word/2016/wordml/cid" xmlns:w16="http://schemas.microsoft.com/office/word/2018/wordml" xmlns:w16du="http://schemas.microsoft.com/office/word/2023/wordml/word16du" xmlns:w16sdtdh="http://schemas.microsoft.com/office/word/2020/wordml/sdtdatahash" xmlns:w16sdtfl="http://schemas.microsoft.com/office/word/2024/wordml/sdtformatlock" xmlns:w16se="http://schemas.microsoft.com/office/word/2015/wordml/symex" xmlns:wpg="http://schemas.microsoft.com/office/word/2010/wordprocessingGroup" xmlns:wpi="http://schemas.microsoft.com/office/word/2010/wordprocessingInk" xmlns:wne="http://schemas.microsoft.com/office/word/2006/wordml" xmlns:wps="http://schemas.microsoft.com/office/word/2010/wordprocessingShape" mc:Ignorable="w14 w15 w16se w16cid w16 w16cex w16sdtdh w16sdtfl w16du wp14">
   <w:abstractNum w:abstractNumId="0" w15:restartNumberingAfterBreak="0">
-    <w:nsid w:val="483B5162"/>
+    <w:nsid w:val="2A646AD2"/>
     <w:multiLevelType w:val="hybridMultilevel"/>
-    <w:tmpl w:val="E1ECC588"/>
-    <w:lvl w:ilvl="0" w:tplc="A7E20694">
+    <w:tmpl w:val="79902A5E"/>
+    <w:lvl w:ilvl="0" w:tplc="E1483978">
       <w:start w:val="1"/>
       <w:numFmt w:val="bullet"/>
       <w:lvlText w:val="•"/>
@@ -6401,7 +6491,7 @@
         <w:ind w:left="540" w:hanging="270"/>
       </w:pPr>
     </w:lvl>
-    <w:lvl w:ilvl="1" w:tplc="D556EF78">
+    <w:lvl w:ilvl="1" w:tplc="FEE2F148">
       <w:start w:val="1"/>
       <w:numFmt w:val="bullet"/>
       <w:lvlText w:val="–"/>
@@ -6410,47 +6500,47 @@
         <w:ind w:left="1080" w:hanging="270"/>
       </w:pPr>
     </w:lvl>
-    <w:lvl w:ilvl="2" w:tplc="7A42AA50">
+    <w:lvl w:ilvl="2" w:tplc="02D86544">
       <w:numFmt w:val="decimal"/>
       <w:lvlText w:val=""/>
       <w:lvlJc w:val="left"/>
     </w:lvl>
-    <w:lvl w:ilvl="3" w:tplc="468CEBEE">
+    <w:lvl w:ilvl="3" w:tplc="4972F550">
       <w:numFmt w:val="decimal"/>
       <w:lvlText w:val=""/>
       <w:lvlJc w:val="left"/>
     </w:lvl>
-    <w:lvl w:ilvl="4" w:tplc="A44C8166">
+    <w:lvl w:ilvl="4" w:tplc="A5C26DE6">
       <w:numFmt w:val="decimal"/>
       <w:lvlText w:val=""/>
       <w:lvlJc w:val="left"/>
     </w:lvl>
-    <w:lvl w:ilvl="5" w:tplc="8BD8479A">
+    <w:lvl w:ilvl="5" w:tplc="8BD26C02">
       <w:numFmt w:val="decimal"/>
       <w:lvlText w:val=""/>
       <w:lvlJc w:val="left"/>
     </w:lvl>
-    <w:lvl w:ilvl="6" w:tplc="4274EF42">
+    <w:lvl w:ilvl="6" w:tplc="25D4B47A">
       <w:numFmt w:val="decimal"/>
       <w:lvlText w:val=""/>
       <w:lvlJc w:val="left"/>
     </w:lvl>
-    <w:lvl w:ilvl="7" w:tplc="594AED08">
+    <w:lvl w:ilvl="7" w:tplc="5C3A9C5E">
       <w:numFmt w:val="decimal"/>
       <w:lvlText w:val=""/>
       <w:lvlJc w:val="left"/>
     </w:lvl>
-    <w:lvl w:ilvl="8" w:tplc="E4E4A644">
+    <w:lvl w:ilvl="8" w:tplc="39549888">
       <w:numFmt w:val="decimal"/>
       <w:lvlText w:val=""/>
       <w:lvlJc w:val="left"/>
     </w:lvl>
   </w:abstractNum>
   <w:abstractNum w:abstractNumId="1" w15:restartNumberingAfterBreak="0">
-    <w:nsid w:val="4BD44814"/>
+    <w:nsid w:val="3B2132E5"/>
     <w:multiLevelType w:val="hybridMultilevel"/>
-    <w:tmpl w:val="8CA04DD2"/>
-    <w:lvl w:ilvl="0" w:tplc="C7908CE2" w:tentative="1">
+    <w:tmpl w:val="94EA5DD6"/>
+    <w:lvl w:ilvl="0" w:tplc="76C27D54" w:tentative="1">
       <w:start w:val="1"/>
       <w:numFmt w:val="bullet"/>
       <w:lvlText w:val="●"/>
@@ -6459,7 +6549,7 @@
         <w:ind w:left="720" w:hanging="360"/>
       </w:pPr>
     </w:lvl>
-    <w:lvl w:ilvl="1" w:tplc="65502BBE" w:tentative="1">
+    <w:lvl w:ilvl="1" w:tplc="5FFE2F9A" w:tentative="1">
       <w:start w:val="1"/>
       <w:numFmt w:val="bullet"/>
       <w:lvlText w:val="○"/>
@@ -6468,7 +6558,7 @@
         <w:ind w:left="1440" w:hanging="360"/>
       </w:pPr>
     </w:lvl>
-    <w:lvl w:ilvl="2" w:tplc="67A82216" w:tentative="1">
+    <w:lvl w:ilvl="2" w:tplc="97B2325A" w:tentative="1">
       <w:start w:val="1"/>
       <w:numFmt w:val="bullet"/>
       <w:lvlText w:val="■"/>
@@ -6477,7 +6567,7 @@
         <w:ind w:left="2160" w:hanging="360"/>
       </w:pPr>
     </w:lvl>
-    <w:lvl w:ilvl="3" w:tplc="22CA16D6" w:tentative="1">
+    <w:lvl w:ilvl="3" w:tplc="252A1EFE" w:tentative="1">
       <w:start w:val="1"/>
       <w:numFmt w:val="bullet"/>
       <w:lvlText w:val="●"/>
@@ -6486,7 +6576,7 @@
         <w:ind w:left="2880" w:hanging="360"/>
       </w:pPr>
     </w:lvl>
-    <w:lvl w:ilvl="4" w:tplc="4E5ECFE8" w:tentative="1">
+    <w:lvl w:ilvl="4" w:tplc="4FFCD8CC" w:tentative="1">
       <w:start w:val="1"/>
       <w:numFmt w:val="bullet"/>
       <w:lvlText w:val="○"/>
@@ -6495,7 +6585,7 @@
         <w:ind w:left="3600" w:hanging="360"/>
       </w:pPr>
     </w:lvl>
-    <w:lvl w:ilvl="5" w:tplc="B588DB90" w:tentative="1">
+    <w:lvl w:ilvl="5" w:tplc="8F74F33C" w:tentative="1">
       <w:start w:val="1"/>
       <w:numFmt w:val="bullet"/>
       <w:lvlText w:val="■"/>
@@ -6504,7 +6594,7 @@
         <w:ind w:left="4320" w:hanging="360"/>
       </w:pPr>
     </w:lvl>
-    <w:lvl w:ilvl="6" w:tplc="DF381C84" w:tentative="1">
+    <w:lvl w:ilvl="6" w:tplc="01660B3A" w:tentative="1">
       <w:start w:val="1"/>
       <w:numFmt w:val="bullet"/>
       <w:lvlText w:val="●"/>
@@ -6513,7 +6603,7 @@
         <w:ind w:left="5040" w:hanging="360"/>
       </w:pPr>
     </w:lvl>
-    <w:lvl w:ilvl="7" w:tplc="476C7482" w:tentative="1">
+    <w:lvl w:ilvl="7" w:tplc="F5044FAE" w:tentative="1">
       <w:start w:val="1"/>
       <w:numFmt w:val="bullet"/>
       <w:lvlText w:val="●"/>
@@ -6522,7 +6612,7 @@
         <w:ind w:left="5760" w:hanging="360"/>
       </w:pPr>
     </w:lvl>
-    <w:lvl w:ilvl="8" w:tplc="13B0A738" w:tentative="1">
+    <w:lvl w:ilvl="8" w:tplc="251E5A58" w:tentative="1">
       <w:start w:val="1"/>
       <w:numFmt w:val="bullet"/>
       <w:lvlText w:val="●"/>
@@ -6533,10 +6623,10 @@
     </w:lvl>
   </w:abstractNum>
   <w:abstractNum w:abstractNumId="2" w15:restartNumberingAfterBreak="0">
-    <w:nsid w:val="65374634"/>
+    <w:nsid w:val="7C6C07C2"/>
     <w:multiLevelType w:val="hybridMultilevel"/>
-    <w:tmpl w:val="1B144A88"/>
-    <w:lvl w:ilvl="0" w:tplc="9E98D596">
+    <w:tmpl w:val="87D808A6"/>
+    <w:lvl w:ilvl="0" w:tplc="4CB63240">
       <w:start w:val="1"/>
       <w:numFmt w:val="decimal"/>
       <w:lvlText w:val="%1."/>
@@ -6545,60 +6635,60 @@
         <w:ind w:left="540" w:hanging="360"/>
       </w:pPr>
     </w:lvl>
-    <w:lvl w:ilvl="1" w:tplc="9746CDAC">
+    <w:lvl w:ilvl="1" w:tplc="27647B68">
       <w:numFmt w:val="decimal"/>
       <w:lvlText w:val=""/>
       <w:lvlJc w:val="left"/>
     </w:lvl>
-    <w:lvl w:ilvl="2" w:tplc="E3CE1CDE">
+    <w:lvl w:ilvl="2" w:tplc="B7BC3B5E">
       <w:numFmt w:val="decimal"/>
       <w:lvlText w:val=""/>
       <w:lvlJc w:val="left"/>
     </w:lvl>
-    <w:lvl w:ilvl="3" w:tplc="EAB0EFEC">
+    <w:lvl w:ilvl="3" w:tplc="DF6A60DA">
       <w:numFmt w:val="decimal"/>
       <w:lvlText w:val=""/>
       <w:lvlJc w:val="left"/>
     </w:lvl>
-    <w:lvl w:ilvl="4" w:tplc="F71811C0">
+    <w:lvl w:ilvl="4" w:tplc="0818E8A0">
       <w:numFmt w:val="decimal"/>
       <w:lvlText w:val=""/>
       <w:lvlJc w:val="left"/>
     </w:lvl>
-    <w:lvl w:ilvl="5" w:tplc="798A0F5C">
+    <w:lvl w:ilvl="5" w:tplc="ED0C8612">
       <w:numFmt w:val="decimal"/>
       <w:lvlText w:val=""/>
       <w:lvlJc w:val="left"/>
     </w:lvl>
-    <w:lvl w:ilvl="6" w:tplc="8ABCD0EC">
+    <w:lvl w:ilvl="6" w:tplc="EF624D20">
       <w:numFmt w:val="decimal"/>
       <w:lvlText w:val=""/>
       <w:lvlJc w:val="left"/>
     </w:lvl>
-    <w:lvl w:ilvl="7" w:tplc="AC885002">
+    <w:lvl w:ilvl="7" w:tplc="1CBA7C46">
       <w:numFmt w:val="decimal"/>
       <w:lvlText w:val=""/>
       <w:lvlJc w:val="left"/>
     </w:lvl>
-    <w:lvl w:ilvl="8" w:tplc="E072EF54">
+    <w:lvl w:ilvl="8" w:tplc="206AFB28">
       <w:numFmt w:val="decimal"/>
       <w:lvlText w:val=""/>
       <w:lvlJc w:val="left"/>
     </w:lvl>
   </w:abstractNum>
-  <w:num w:numId="1" w16cid:durableId="939993543">
+  <w:num w:numId="1" w16cid:durableId="1564483599">
     <w:abstractNumId w:val="1"/>
     <w:lvlOverride w:ilvl="0">
       <w:startOverride w:val="1"/>
     </w:lvlOverride>
   </w:num>
-  <w:num w:numId="2" w16cid:durableId="2070808937">
+  <w:num w:numId="2" w16cid:durableId="1539202655">
     <w:abstractNumId w:val="2"/>
     <w:lvlOverride w:ilvl="0">
       <w:startOverride w:val="1"/>
     </w:lvlOverride>
   </w:num>
-  <w:num w:numId="3" w16cid:durableId="810290465">
+  <w:num w:numId="3" w16cid:durableId="1569220407">
     <w:abstractNumId w:val="0"/>
     <w:lvlOverride w:ilvl="0">
       <w:startOverride w:val="1"/>

</xml_diff>